<commit_message>
feat: modified cnn codes
</commit_message>
<xml_diff>
--- a/template_final_report.docx
+++ b/template_final_report.docx
@@ -1781,45 +1781,59 @@
               <w:spacing w:after="0" w:line="240" w:lineRule="auto"/>
               <w:rPr>
                 <w:rFonts w:ascii="Arial" w:hAnsi="Arial" w:cs="Arial"/>
-                <w:sz w:val="20"/>
-              </w:rPr>
-            </w:pPr>
-          </w:p>
-          <w:p>
-            <w:pPr>
-              <w:spacing w:after="0" w:line="240" w:lineRule="auto"/>
+                <w:b w:val="0"/>
+                <w:bCs w:val="0"/>
+                <w:sz w:val="20"/>
+              </w:rPr>
+            </w:pPr>
+            <w:r>
               <w:rPr>
                 <w:rFonts w:ascii="Arial" w:hAnsi="Arial" w:cs="Arial"/>
                 <w:sz w:val="20"/>
               </w:rPr>
-            </w:pPr>
-          </w:p>
-          <w:p>
-            <w:pPr>
-              <w:spacing w:after="0" w:line="240" w:lineRule="auto"/>
-              <w:rPr>
-                <w:rFonts w:ascii="Arial" w:hAnsi="Arial" w:cs="Arial"/>
-                <w:sz w:val="20"/>
-              </w:rPr>
-            </w:pPr>
-          </w:p>
-          <w:p>
-            <w:pPr>
-              <w:spacing w:after="0" w:line="240" w:lineRule="auto"/>
-              <w:rPr>
-                <w:rFonts w:ascii="Arial" w:hAnsi="Arial" w:cs="Arial"/>
-                <w:b w:val="0"/>
-                <w:bCs w:val="0"/>
-                <w:sz w:val="20"/>
-              </w:rPr>
-            </w:pPr>
-            <w:r>
-              <w:rPr>
-                <w:b w:val="0"/>
-                <w:bCs w:val="0"/>
-                <w:color w:val="FF0000"/>
-              </w:rPr>
-              <w:br/>
+              <w:drawing>
+                <wp:inline distT="0" distB="0" distL="180" distR="180">
+                  <wp:extent cx="5731510" cy="3235960"/>
+                  <wp:effectExtent l="0" t="0" r="0" b="0"/>
+                  <wp:docPr id="1027" name=""/>
+                  <wp:cNvGraphicFramePr>
+                    <a:graphicFrameLocks xmlns:a="http://schemas.openxmlformats.org/drawingml/2006/main" noChangeAspect="1"/>
+                  </wp:cNvGraphicFramePr>
+                  <a:graphic xmlns:a="http://schemas.openxmlformats.org/drawingml/2006/main">
+                    <a:graphicData uri="http://schemas.openxmlformats.org/drawingml/2006/picture">
+                      <pic:pic xmlns:pic="http://schemas.openxmlformats.org/drawingml/2006/picture">
+                        <pic:nvPicPr>
+                          <pic:cNvPr id="1027" name=""/>
+                          <pic:cNvPicPr>
+                            <a:picLocks noChangeAspect="1" noUngrp="1"/>
+                          </pic:cNvPicPr>
+                        </pic:nvPicPr>
+                        <pic:blipFill>
+                          <a:blip r:embed="rId3">
+                            <a:extLst>
+                              <a:ext uri="{28A0092B-C50C-407E-A947-70E740481C1C}">
+                                <a14:useLocalDpi xmlns:a14="http://schemas.microsoft.com/office/drawing/2010/main" val="0"/>
+                              </a:ext>
+                            </a:extLst>
+                          </a:blip>
+                          <a:stretch>
+                            <a:fillRect/>
+                          </a:stretch>
+                        </pic:blipFill>
+                        <pic:spPr>
+                          <a:xfrm>
+                            <a:off x="0" y="0"/>
+                            <a:ext cx="5731510" cy="3235960"/>
+                          </a:xfrm>
+                          <a:prstGeom prst="rect">
+                            <a:avLst/>
+                          </a:prstGeom>
+                        </pic:spPr>
+                      </pic:pic>
+                    </a:graphicData>
+                  </a:graphic>
+                </wp:inline>
+              </w:drawing>
             </w:r>
           </w:p>
         </w:tc>

</xml_diff>

<commit_message>
feat: modified gan codes
</commit_message>
<xml_diff>
--- a/template_final_report.docx
+++ b/template_final_report.docx
@@ -200,13 +200,15 @@
               <w:rPr>
                 <w:lang/>
                 <w:rFonts w:ascii="Consolas" w:hAnsi="Consolas"/>
-                <w:rtl w:val="off"/>
-              </w:rPr>
-            </w:pPr>
-            <w:r>
-              <w:rPr>
-                <w:lang/>
-                <w:rFonts w:ascii="Consolas" w:hAnsi="Consolas"/>
+                <w:color w:val="000000"/>
+                <w:rtl w:val="off"/>
+              </w:rPr>
+            </w:pPr>
+            <w:r>
+              <w:rPr>
+                <w:lang/>
+                <w:rFonts w:ascii="Consolas" w:hAnsi="Consolas"/>
+                <w:color w:val="000000"/>
                 <w:rtl w:val="off"/>
               </w:rPr>
               <w:t>class MyLeNet5_2(nn.Module):</w:t>
@@ -218,13 +220,15 @@
               <w:rPr>
                 <w:lang/>
                 <w:rFonts w:ascii="Consolas" w:hAnsi="Consolas"/>
-                <w:rtl w:val="off"/>
-              </w:rPr>
-            </w:pPr>
-            <w:r>
-              <w:rPr>
-                <w:lang/>
-                <w:rFonts w:ascii="Consolas" w:hAnsi="Consolas"/>
+                <w:color w:val="000000"/>
+                <w:rtl w:val="off"/>
+              </w:rPr>
+            </w:pPr>
+            <w:r>
+              <w:rPr>
+                <w:lang/>
+                <w:rFonts w:ascii="Consolas" w:hAnsi="Consolas"/>
+                <w:color w:val="000000"/>
                 <w:rtl w:val="off"/>
               </w:rPr>
               <w:t xml:space="preserve">    def __init__(self):</w:t>
@@ -236,13 +240,15 @@
               <w:rPr>
                 <w:lang/>
                 <w:rFonts w:ascii="Consolas" w:hAnsi="Consolas"/>
-                <w:rtl w:val="off"/>
-              </w:rPr>
-            </w:pPr>
-            <w:r>
-              <w:rPr>
-                <w:lang/>
-                <w:rFonts w:ascii="Consolas" w:hAnsi="Consolas"/>
+                <w:color w:val="000000"/>
+                <w:rtl w:val="off"/>
+              </w:rPr>
+            </w:pPr>
+            <w:r>
+              <w:rPr>
+                <w:lang/>
+                <w:rFonts w:ascii="Consolas" w:hAnsi="Consolas"/>
+                <w:color w:val="000000"/>
                 <w:rtl w:val="off"/>
               </w:rPr>
               <w:t xml:space="preserve">        super(MyLeNet5_2, self).__init__()</w:t>
@@ -254,23 +260,26 @@
               <w:rPr>
                 <w:lang/>
                 <w:rFonts w:ascii="Consolas" w:hAnsi="Consolas"/>
-                <w:rtl w:val="off"/>
-              </w:rPr>
-            </w:pPr>
-          </w:p>
-          <w:p>
-            <w:pPr>
-              <w:spacing w:after="20" w:line="240" w:lineRule="auto"/>
-              <w:rPr>
-                <w:lang/>
-                <w:rFonts w:ascii="Consolas" w:hAnsi="Consolas"/>
-                <w:rtl w:val="off"/>
-              </w:rPr>
-            </w:pPr>
-            <w:r>
-              <w:rPr>
-                <w:lang/>
-                <w:rFonts w:ascii="Consolas" w:hAnsi="Consolas"/>
+                <w:color w:val="000000"/>
+                <w:rtl w:val="off"/>
+              </w:rPr>
+            </w:pPr>
+          </w:p>
+          <w:p>
+            <w:pPr>
+              <w:spacing w:after="20" w:line="240" w:lineRule="auto"/>
+              <w:rPr>
+                <w:lang/>
+                <w:rFonts w:ascii="Consolas" w:hAnsi="Consolas"/>
+                <w:color w:val="000000"/>
+                <w:rtl w:val="off"/>
+              </w:rPr>
+            </w:pPr>
+            <w:r>
+              <w:rPr>
+                <w:lang/>
+                <w:rFonts w:ascii="Consolas" w:hAnsi="Consolas"/>
+                <w:color w:val="000000"/>
                 <w:rtl w:val="off"/>
               </w:rPr>
               <w:t xml:space="preserve">        # TODO ①-A : conv_1  →  Conv2d(1, 32, kernel_size=5, padding=2)</w:t>
@@ -282,13 +291,15 @@
               <w:rPr>
                 <w:lang/>
                 <w:rFonts w:ascii="Consolas" w:hAnsi="Consolas"/>
-                <w:rtl w:val="off"/>
-              </w:rPr>
-            </w:pPr>
-            <w:r>
-              <w:rPr>
-                <w:lang/>
-                <w:rFonts w:ascii="Consolas" w:hAnsi="Consolas"/>
+                <w:color w:val="000000"/>
+                <w:rtl w:val="off"/>
+              </w:rPr>
+            </w:pPr>
+            <w:r>
+              <w:rPr>
+                <w:lang/>
+                <w:rFonts w:ascii="Consolas" w:hAnsi="Consolas"/>
+                <w:color w:val="000000"/>
                 <w:rtl w:val="off"/>
               </w:rPr>
               <w:t xml:space="preserve">        self.conv_1    = nn.Conv2d(1, 32, kernel_size=5, padding=2)   # ← 교체하세요</w:t>
@@ -300,23 +311,26 @@
               <w:rPr>
                 <w:lang/>
                 <w:rFonts w:ascii="Consolas" w:hAnsi="Consolas"/>
-                <w:rtl w:val="off"/>
-              </w:rPr>
-            </w:pPr>
-          </w:p>
-          <w:p>
-            <w:pPr>
-              <w:spacing w:after="20" w:line="240" w:lineRule="auto"/>
-              <w:rPr>
-                <w:lang/>
-                <w:rFonts w:ascii="Consolas" w:hAnsi="Consolas"/>
-                <w:rtl w:val="off"/>
-              </w:rPr>
-            </w:pPr>
-            <w:r>
-              <w:rPr>
-                <w:lang/>
-                <w:rFonts w:ascii="Consolas" w:hAnsi="Consolas"/>
+                <w:color w:val="000000"/>
+                <w:rtl w:val="off"/>
+              </w:rPr>
+            </w:pPr>
+          </w:p>
+          <w:p>
+            <w:pPr>
+              <w:spacing w:after="20" w:line="240" w:lineRule="auto"/>
+              <w:rPr>
+                <w:lang/>
+                <w:rFonts w:ascii="Consolas" w:hAnsi="Consolas"/>
+                <w:color w:val="000000"/>
+                <w:rtl w:val="off"/>
+              </w:rPr>
+            </w:pPr>
+            <w:r>
+              <w:rPr>
+                <w:lang/>
+                <w:rFonts w:ascii="Consolas" w:hAnsi="Consolas"/>
+                <w:color w:val="000000"/>
                 <w:rtl w:val="off"/>
               </w:rPr>
               <w:t xml:space="preserve">        # TODO ①-B : maxpool_1  →  MaxPool2d(kernel_size=(2,2), stride=2)</w:t>
@@ -328,13 +342,15 @@
               <w:rPr>
                 <w:lang/>
                 <w:rFonts w:ascii="Consolas" w:hAnsi="Consolas"/>
-                <w:rtl w:val="off"/>
-              </w:rPr>
-            </w:pPr>
-            <w:r>
-              <w:rPr>
-                <w:lang/>
-                <w:rFonts w:ascii="Consolas" w:hAnsi="Consolas"/>
+                <w:color w:val="000000"/>
+                <w:rtl w:val="off"/>
+              </w:rPr>
+            </w:pPr>
+            <w:r>
+              <w:rPr>
+                <w:lang/>
+                <w:rFonts w:ascii="Consolas" w:hAnsi="Consolas"/>
+                <w:color w:val="000000"/>
                 <w:rtl w:val="off"/>
               </w:rPr>
               <w:t xml:space="preserve">        self.maxpool_1 = nn.MaxPool2d(kernel_size=(2,2), stride=2)   # ← 교체하세요</w:t>
@@ -346,23 +362,26 @@
               <w:rPr>
                 <w:lang/>
                 <w:rFonts w:ascii="Consolas" w:hAnsi="Consolas"/>
-                <w:rtl w:val="off"/>
-              </w:rPr>
-            </w:pPr>
-          </w:p>
-          <w:p>
-            <w:pPr>
-              <w:spacing w:after="20" w:line="240" w:lineRule="auto"/>
-              <w:rPr>
-                <w:lang/>
-                <w:rFonts w:ascii="Consolas" w:hAnsi="Consolas"/>
-                <w:rtl w:val="off"/>
-              </w:rPr>
-            </w:pPr>
-            <w:r>
-              <w:rPr>
-                <w:lang/>
-                <w:rFonts w:ascii="Consolas" w:hAnsi="Consolas"/>
+                <w:color w:val="000000"/>
+                <w:rtl w:val="off"/>
+              </w:rPr>
+            </w:pPr>
+          </w:p>
+          <w:p>
+            <w:pPr>
+              <w:spacing w:after="20" w:line="240" w:lineRule="auto"/>
+              <w:rPr>
+                <w:lang/>
+                <w:rFonts w:ascii="Consolas" w:hAnsi="Consolas"/>
+                <w:color w:val="000000"/>
+                <w:rtl w:val="off"/>
+              </w:rPr>
+            </w:pPr>
+            <w:r>
+              <w:rPr>
+                <w:lang/>
+                <w:rFonts w:ascii="Consolas" w:hAnsi="Consolas"/>
+                <w:color w:val="000000"/>
                 <w:rtl w:val="off"/>
               </w:rPr>
               <w:t xml:space="preserve">        # TODO ①-C : conv_2  →  Conv2d(32, 64, kernel_size=5)</w:t>
@@ -374,13 +393,15 @@
               <w:rPr>
                 <w:lang/>
                 <w:rFonts w:ascii="Consolas" w:hAnsi="Consolas"/>
-                <w:rtl w:val="off"/>
-              </w:rPr>
-            </w:pPr>
-            <w:r>
-              <w:rPr>
-                <w:lang/>
-                <w:rFonts w:ascii="Consolas" w:hAnsi="Consolas"/>
+                <w:color w:val="000000"/>
+                <w:rtl w:val="off"/>
+              </w:rPr>
+            </w:pPr>
+            <w:r>
+              <w:rPr>
+                <w:lang/>
+                <w:rFonts w:ascii="Consolas" w:hAnsi="Consolas"/>
+                <w:color w:val="000000"/>
                 <w:rtl w:val="off"/>
               </w:rPr>
               <w:t xml:space="preserve">        self.conv_2    = nn.Conv2d(32, 64, kernel_size=5)   # ← 교체하세요</w:t>
@@ -392,23 +413,26 @@
               <w:rPr>
                 <w:lang/>
                 <w:rFonts w:ascii="Consolas" w:hAnsi="Consolas"/>
-                <w:rtl w:val="off"/>
-              </w:rPr>
-            </w:pPr>
-          </w:p>
-          <w:p>
-            <w:pPr>
-              <w:spacing w:after="20" w:line="240" w:lineRule="auto"/>
-              <w:rPr>
-                <w:lang/>
-                <w:rFonts w:ascii="Consolas" w:hAnsi="Consolas"/>
-                <w:rtl w:val="off"/>
-              </w:rPr>
-            </w:pPr>
-            <w:r>
-              <w:rPr>
-                <w:lang/>
-                <w:rFonts w:ascii="Consolas" w:hAnsi="Consolas"/>
+                <w:color w:val="000000"/>
+                <w:rtl w:val="off"/>
+              </w:rPr>
+            </w:pPr>
+          </w:p>
+          <w:p>
+            <w:pPr>
+              <w:spacing w:after="20" w:line="240" w:lineRule="auto"/>
+              <w:rPr>
+                <w:lang/>
+                <w:rFonts w:ascii="Consolas" w:hAnsi="Consolas"/>
+                <w:color w:val="000000"/>
+                <w:rtl w:val="off"/>
+              </w:rPr>
+            </w:pPr>
+            <w:r>
+              <w:rPr>
+                <w:lang/>
+                <w:rFonts w:ascii="Consolas" w:hAnsi="Consolas"/>
+                <w:color w:val="000000"/>
                 <w:rtl w:val="off"/>
               </w:rPr>
               <w:t xml:space="preserve">        # TODO ①-D : maxpool_2  →  MaxPool2d(kernel_size=(2,2), stride=2)</w:t>
@@ -420,13 +444,15 @@
               <w:rPr>
                 <w:lang/>
                 <w:rFonts w:ascii="Consolas" w:hAnsi="Consolas"/>
-                <w:rtl w:val="off"/>
-              </w:rPr>
-            </w:pPr>
-            <w:r>
-              <w:rPr>
-                <w:lang/>
-                <w:rFonts w:ascii="Consolas" w:hAnsi="Consolas"/>
+                <w:color w:val="000000"/>
+                <w:rtl w:val="off"/>
+              </w:rPr>
+            </w:pPr>
+            <w:r>
+              <w:rPr>
+                <w:lang/>
+                <w:rFonts w:ascii="Consolas" w:hAnsi="Consolas"/>
+                <w:color w:val="000000"/>
                 <w:rtl w:val="off"/>
               </w:rPr>
               <w:t xml:space="preserve">        self.maxpool_2 = nn.MaxPool2d(kernel_size=(2,2), stride=2)   # ← 교체하세요</w:t>
@@ -438,23 +464,26 @@
               <w:rPr>
                 <w:lang/>
                 <w:rFonts w:ascii="Consolas" w:hAnsi="Consolas"/>
-                <w:rtl w:val="off"/>
-              </w:rPr>
-            </w:pPr>
-          </w:p>
-          <w:p>
-            <w:pPr>
-              <w:spacing w:after="20" w:line="240" w:lineRule="auto"/>
-              <w:rPr>
-                <w:lang/>
-                <w:rFonts w:ascii="Consolas" w:hAnsi="Consolas"/>
-                <w:rtl w:val="off"/>
-              </w:rPr>
-            </w:pPr>
-            <w:r>
-              <w:rPr>
-                <w:lang/>
-                <w:rFonts w:ascii="Consolas" w:hAnsi="Consolas"/>
+                <w:color w:val="000000"/>
+                <w:rtl w:val="off"/>
+              </w:rPr>
+            </w:pPr>
+          </w:p>
+          <w:p>
+            <w:pPr>
+              <w:spacing w:after="20" w:line="240" w:lineRule="auto"/>
+              <w:rPr>
+                <w:lang/>
+                <w:rFonts w:ascii="Consolas" w:hAnsi="Consolas"/>
+                <w:color w:val="000000"/>
+                <w:rtl w:val="off"/>
+              </w:rPr>
+            </w:pPr>
+            <w:r>
+              <w:rPr>
+                <w:lang/>
+                <w:rFonts w:ascii="Consolas" w:hAnsi="Consolas"/>
+                <w:color w:val="000000"/>
                 <w:rtl w:val="off"/>
               </w:rPr>
               <w:t xml:space="preserve">        # TODO ①-E : conv_3  →  Conv2d(64, 256, kernel_size=5)</w:t>
@@ -466,13 +495,15 @@
               <w:rPr>
                 <w:lang/>
                 <w:rFonts w:ascii="Consolas" w:hAnsi="Consolas"/>
-                <w:rtl w:val="off"/>
-              </w:rPr>
-            </w:pPr>
-            <w:r>
-              <w:rPr>
-                <w:lang/>
-                <w:rFonts w:ascii="Consolas" w:hAnsi="Consolas"/>
+                <w:color w:val="000000"/>
+                <w:rtl w:val="off"/>
+              </w:rPr>
+            </w:pPr>
+            <w:r>
+              <w:rPr>
+                <w:lang/>
+                <w:rFonts w:ascii="Consolas" w:hAnsi="Consolas"/>
+                <w:color w:val="000000"/>
                 <w:rtl w:val="off"/>
               </w:rPr>
               <w:t xml:space="preserve">        self.conv_3    = nn.Conv2d(64, 256, kernel_size=5)   # ← 교체하세요</w:t>
@@ -484,23 +515,26 @@
               <w:rPr>
                 <w:lang/>
                 <w:rFonts w:ascii="Consolas" w:hAnsi="Consolas"/>
-                <w:rtl w:val="off"/>
-              </w:rPr>
-            </w:pPr>
-          </w:p>
-          <w:p>
-            <w:pPr>
-              <w:spacing w:after="20" w:line="240" w:lineRule="auto"/>
-              <w:rPr>
-                <w:lang/>
-                <w:rFonts w:ascii="Consolas" w:hAnsi="Consolas"/>
-                <w:rtl w:val="off"/>
-              </w:rPr>
-            </w:pPr>
-            <w:r>
-              <w:rPr>
-                <w:lang/>
-                <w:rFonts w:ascii="Consolas" w:hAnsi="Consolas"/>
+                <w:color w:val="000000"/>
+                <w:rtl w:val="off"/>
+              </w:rPr>
+            </w:pPr>
+          </w:p>
+          <w:p>
+            <w:pPr>
+              <w:spacing w:after="20" w:line="240" w:lineRule="auto"/>
+              <w:rPr>
+                <w:lang/>
+                <w:rFonts w:ascii="Consolas" w:hAnsi="Consolas"/>
+                <w:color w:val="000000"/>
+                <w:rtl w:val="off"/>
+              </w:rPr>
+            </w:pPr>
+            <w:r>
+              <w:rPr>
+                <w:lang/>
+                <w:rFonts w:ascii="Consolas" w:hAnsi="Consolas"/>
+                <w:color w:val="000000"/>
                 <w:rtl w:val="off"/>
               </w:rPr>
               <w:t xml:space="preserve">        # TODO ①-F : relu  →  nn.ReLU()</w:t>
@@ -512,13 +546,15 @@
               <w:rPr>
                 <w:lang/>
                 <w:rFonts w:ascii="Consolas" w:hAnsi="Consolas"/>
-                <w:rtl w:val="off"/>
-              </w:rPr>
-            </w:pPr>
-            <w:r>
-              <w:rPr>
-                <w:lang/>
-                <w:rFonts w:ascii="Consolas" w:hAnsi="Consolas"/>
+                <w:color w:val="000000"/>
+                <w:rtl w:val="off"/>
+              </w:rPr>
+            </w:pPr>
+            <w:r>
+              <w:rPr>
+                <w:lang/>
+                <w:rFonts w:ascii="Consolas" w:hAnsi="Consolas"/>
+                <w:color w:val="000000"/>
                 <w:rtl w:val="off"/>
               </w:rPr>
               <w:t xml:space="preserve">        self.relu      = nn.ReLU()   # ← 교체하세요</w:t>
@@ -530,23 +566,26 @@
               <w:rPr>
                 <w:lang/>
                 <w:rFonts w:ascii="Consolas" w:hAnsi="Consolas"/>
-                <w:rtl w:val="off"/>
-              </w:rPr>
-            </w:pPr>
-          </w:p>
-          <w:p>
-            <w:pPr>
-              <w:spacing w:after="20" w:line="240" w:lineRule="auto"/>
-              <w:rPr>
-                <w:lang/>
-                <w:rFonts w:ascii="Consolas" w:hAnsi="Consolas"/>
-                <w:rtl w:val="off"/>
-              </w:rPr>
-            </w:pPr>
-            <w:r>
-              <w:rPr>
-                <w:lang/>
-                <w:rFonts w:ascii="Consolas" w:hAnsi="Consolas"/>
+                <w:color w:val="000000"/>
+                <w:rtl w:val="off"/>
+              </w:rPr>
+            </w:pPr>
+          </w:p>
+          <w:p>
+            <w:pPr>
+              <w:spacing w:after="20" w:line="240" w:lineRule="auto"/>
+              <w:rPr>
+                <w:lang/>
+                <w:rFonts w:ascii="Consolas" w:hAnsi="Consolas"/>
+                <w:color w:val="000000"/>
+                <w:rtl w:val="off"/>
+              </w:rPr>
+            </w:pPr>
+            <w:r>
+              <w:rPr>
+                <w:lang/>
+                <w:rFonts w:ascii="Consolas" w:hAnsi="Consolas"/>
+                <w:color w:val="000000"/>
                 <w:rtl w:val="off"/>
               </w:rPr>
               <w:t xml:space="preserve">        # TODO ①-G : fc_1  →  Linear(256, 128)</w:t>
@@ -558,13 +597,15 @@
               <w:rPr>
                 <w:lang/>
                 <w:rFonts w:ascii="Consolas" w:hAnsi="Consolas"/>
-                <w:rtl w:val="off"/>
-              </w:rPr>
-            </w:pPr>
-            <w:r>
-              <w:rPr>
-                <w:lang/>
-                <w:rFonts w:ascii="Consolas" w:hAnsi="Consolas"/>
+                <w:color w:val="000000"/>
+                <w:rtl w:val="off"/>
+              </w:rPr>
+            </w:pPr>
+            <w:r>
+              <w:rPr>
+                <w:lang/>
+                <w:rFonts w:ascii="Consolas" w:hAnsi="Consolas"/>
+                <w:color w:val="000000"/>
                 <w:rtl w:val="off"/>
               </w:rPr>
               <w:t xml:space="preserve">        self.fc_1      = nn.Linear(256, 128)   # ← 교체하세요</w:t>
@@ -576,23 +617,26 @@
               <w:rPr>
                 <w:lang/>
                 <w:rFonts w:ascii="Consolas" w:hAnsi="Consolas"/>
-                <w:rtl w:val="off"/>
-              </w:rPr>
-            </w:pPr>
-          </w:p>
-          <w:p>
-            <w:pPr>
-              <w:spacing w:after="20" w:line="240" w:lineRule="auto"/>
-              <w:rPr>
-                <w:lang/>
-                <w:rFonts w:ascii="Consolas" w:hAnsi="Consolas"/>
-                <w:rtl w:val="off"/>
-              </w:rPr>
-            </w:pPr>
-            <w:r>
-              <w:rPr>
-                <w:lang/>
-                <w:rFonts w:ascii="Consolas" w:hAnsi="Consolas"/>
+                <w:color w:val="000000"/>
+                <w:rtl w:val="off"/>
+              </w:rPr>
+            </w:pPr>
+          </w:p>
+          <w:p>
+            <w:pPr>
+              <w:spacing w:after="20" w:line="240" w:lineRule="auto"/>
+              <w:rPr>
+                <w:lang/>
+                <w:rFonts w:ascii="Consolas" w:hAnsi="Consolas"/>
+                <w:color w:val="000000"/>
+                <w:rtl w:val="off"/>
+              </w:rPr>
+            </w:pPr>
+            <w:r>
+              <w:rPr>
+                <w:lang/>
+                <w:rFonts w:ascii="Consolas" w:hAnsi="Consolas"/>
+                <w:color w:val="000000"/>
                 <w:rtl w:val="off"/>
               </w:rPr>
               <w:t xml:space="preserve">        # TODO ①-H : fc_2  →  Linear(128, 10)</w:t>
@@ -604,13 +648,15 @@
               <w:rPr>
                 <w:lang/>
                 <w:rFonts w:ascii="Consolas" w:hAnsi="Consolas"/>
-                <w:rtl w:val="off"/>
-              </w:rPr>
-            </w:pPr>
-            <w:r>
-              <w:rPr>
-                <w:lang/>
-                <w:rFonts w:ascii="Consolas" w:hAnsi="Consolas"/>
+                <w:color w:val="000000"/>
+                <w:rtl w:val="off"/>
+              </w:rPr>
+            </w:pPr>
+            <w:r>
+              <w:rPr>
+                <w:lang/>
+                <w:rFonts w:ascii="Consolas" w:hAnsi="Consolas"/>
+                <w:color w:val="000000"/>
                 <w:rtl w:val="off"/>
               </w:rPr>
               <w:t xml:space="preserve">        self.fc_2      = nn.Linear(128, 10)   # ← 교체하세요</w:t>
@@ -622,23 +668,26 @@
               <w:rPr>
                 <w:lang/>
                 <w:rFonts w:ascii="Consolas" w:hAnsi="Consolas"/>
-                <w:rtl w:val="off"/>
-              </w:rPr>
-            </w:pPr>
-          </w:p>
-          <w:p>
-            <w:pPr>
-              <w:spacing w:after="20" w:line="240" w:lineRule="auto"/>
-              <w:rPr>
-                <w:lang/>
-                <w:rFonts w:ascii="Consolas" w:hAnsi="Consolas"/>
-                <w:rtl w:val="off"/>
-              </w:rPr>
-            </w:pPr>
-            <w:r>
-              <w:rPr>
-                <w:lang/>
-                <w:rFonts w:ascii="Consolas" w:hAnsi="Consolas"/>
+                <w:color w:val="000000"/>
+                <w:rtl w:val="off"/>
+              </w:rPr>
+            </w:pPr>
+          </w:p>
+          <w:p>
+            <w:pPr>
+              <w:spacing w:after="20" w:line="240" w:lineRule="auto"/>
+              <w:rPr>
+                <w:lang/>
+                <w:rFonts w:ascii="Consolas" w:hAnsi="Consolas"/>
+                <w:color w:val="000000"/>
+                <w:rtl w:val="off"/>
+              </w:rPr>
+            </w:pPr>
+            <w:r>
+              <w:rPr>
+                <w:lang/>
+                <w:rFonts w:ascii="Consolas" w:hAnsi="Consolas"/>
+                <w:color w:val="000000"/>
                 <w:rtl w:val="off"/>
               </w:rPr>
               <w:t xml:space="preserve">    def forward(self, x):</w:t>
@@ -650,13 +699,15 @@
               <w:rPr>
                 <w:lang/>
                 <w:rFonts w:ascii="Consolas" w:hAnsi="Consolas"/>
-                <w:rtl w:val="off"/>
-              </w:rPr>
-            </w:pPr>
-            <w:r>
-              <w:rPr>
-                <w:lang/>
-                <w:rFonts w:ascii="Consolas" w:hAnsi="Consolas"/>
+                <w:color w:val="000000"/>
+                <w:rtl w:val="off"/>
+              </w:rPr>
+            </w:pPr>
+            <w:r>
+              <w:rPr>
+                <w:lang/>
+                <w:rFonts w:ascii="Consolas" w:hAnsi="Consolas"/>
+                <w:color w:val="000000"/>
                 <w:rtl w:val="off"/>
               </w:rPr>
               <w:t xml:space="preserve">        # TODO ② : 순전파 구현</w:t>
@@ -668,13 +719,15 @@
               <w:rPr>
                 <w:lang/>
                 <w:rFonts w:ascii="Consolas" w:hAnsi="Consolas"/>
-                <w:rtl w:val="off"/>
-              </w:rPr>
-            </w:pPr>
-            <w:r>
-              <w:rPr>
-                <w:lang/>
-                <w:rFonts w:ascii="Consolas" w:hAnsi="Consolas"/>
+                <w:color w:val="000000"/>
+                <w:rtl w:val="off"/>
+              </w:rPr>
+            </w:pPr>
+            <w:r>
+              <w:rPr>
+                <w:lang/>
+                <w:rFonts w:ascii="Consolas" w:hAnsi="Consolas"/>
+                <w:color w:val="000000"/>
                 <w:rtl w:val="off"/>
               </w:rPr>
               <w:t xml:space="preserve">        x = self.conv_1(x) # ← 이 줄을 지우고 구현하세요</w:t>
@@ -686,13 +739,15 @@
               <w:rPr>
                 <w:lang/>
                 <w:rFonts w:ascii="Consolas" w:hAnsi="Consolas"/>
-                <w:rtl w:val="off"/>
-              </w:rPr>
-            </w:pPr>
-            <w:r>
-              <w:rPr>
-                <w:lang/>
-                <w:rFonts w:ascii="Consolas" w:hAnsi="Consolas"/>
+                <w:color w:val="000000"/>
+                <w:rtl w:val="off"/>
+              </w:rPr>
+            </w:pPr>
+            <w:r>
+              <w:rPr>
+                <w:lang/>
+                <w:rFonts w:ascii="Consolas" w:hAnsi="Consolas"/>
+                <w:color w:val="000000"/>
                 <w:rtl w:val="off"/>
               </w:rPr>
               <w:t xml:space="preserve">        x = self.relu(x)</w:t>
@@ -704,13 +759,15 @@
               <w:rPr>
                 <w:lang/>
                 <w:rFonts w:ascii="Consolas" w:hAnsi="Consolas"/>
-                <w:rtl w:val="off"/>
-              </w:rPr>
-            </w:pPr>
-            <w:r>
-              <w:rPr>
-                <w:lang/>
-                <w:rFonts w:ascii="Consolas" w:hAnsi="Consolas"/>
+                <w:color w:val="000000"/>
+                <w:rtl w:val="off"/>
+              </w:rPr>
+            </w:pPr>
+            <w:r>
+              <w:rPr>
+                <w:lang/>
+                <w:rFonts w:ascii="Consolas" w:hAnsi="Consolas"/>
+                <w:color w:val="000000"/>
                 <w:rtl w:val="off"/>
               </w:rPr>
               <w:t xml:space="preserve">        x = self.maxpool_1(x)</w:t>
@@ -722,13 +779,15 @@
               <w:rPr>
                 <w:lang/>
                 <w:rFonts w:ascii="Consolas" w:hAnsi="Consolas"/>
-                <w:rtl w:val="off"/>
-              </w:rPr>
-            </w:pPr>
-            <w:r>
-              <w:rPr>
-                <w:lang/>
-                <w:rFonts w:ascii="Consolas" w:hAnsi="Consolas"/>
+                <w:color w:val="000000"/>
+                <w:rtl w:val="off"/>
+              </w:rPr>
+            </w:pPr>
+            <w:r>
+              <w:rPr>
+                <w:lang/>
+                <w:rFonts w:ascii="Consolas" w:hAnsi="Consolas"/>
+                <w:color w:val="000000"/>
                 <w:rtl w:val="off"/>
               </w:rPr>
               <w:t xml:space="preserve">        x = self.conv_2(x)</w:t>
@@ -740,13 +799,15 @@
               <w:rPr>
                 <w:lang/>
                 <w:rFonts w:ascii="Consolas" w:hAnsi="Consolas"/>
-                <w:rtl w:val="off"/>
-              </w:rPr>
-            </w:pPr>
-            <w:r>
-              <w:rPr>
-                <w:lang/>
-                <w:rFonts w:ascii="Consolas" w:hAnsi="Consolas"/>
+                <w:color w:val="000000"/>
+                <w:rtl w:val="off"/>
+              </w:rPr>
+            </w:pPr>
+            <w:r>
+              <w:rPr>
+                <w:lang/>
+                <w:rFonts w:ascii="Consolas" w:hAnsi="Consolas"/>
+                <w:color w:val="000000"/>
                 <w:rtl w:val="off"/>
               </w:rPr>
               <w:t xml:space="preserve">        x = self.relu(x)</w:t>
@@ -758,13 +819,15 @@
               <w:rPr>
                 <w:lang/>
                 <w:rFonts w:ascii="Consolas" w:hAnsi="Consolas"/>
-                <w:rtl w:val="off"/>
-              </w:rPr>
-            </w:pPr>
-            <w:r>
-              <w:rPr>
-                <w:lang/>
-                <w:rFonts w:ascii="Consolas" w:hAnsi="Consolas"/>
+                <w:color w:val="000000"/>
+                <w:rtl w:val="off"/>
+              </w:rPr>
+            </w:pPr>
+            <w:r>
+              <w:rPr>
+                <w:lang/>
+                <w:rFonts w:ascii="Consolas" w:hAnsi="Consolas"/>
+                <w:color w:val="000000"/>
                 <w:rtl w:val="off"/>
               </w:rPr>
               <w:t xml:space="preserve">        x = self.maxpool_2(x)</w:t>
@@ -776,13 +839,15 @@
               <w:rPr>
                 <w:lang/>
                 <w:rFonts w:ascii="Consolas" w:hAnsi="Consolas"/>
-                <w:rtl w:val="off"/>
-              </w:rPr>
-            </w:pPr>
-            <w:r>
-              <w:rPr>
-                <w:lang/>
-                <w:rFonts w:ascii="Consolas" w:hAnsi="Consolas"/>
+                <w:color w:val="000000"/>
+                <w:rtl w:val="off"/>
+              </w:rPr>
+            </w:pPr>
+            <w:r>
+              <w:rPr>
+                <w:lang/>
+                <w:rFonts w:ascii="Consolas" w:hAnsi="Consolas"/>
+                <w:color w:val="000000"/>
                 <w:rtl w:val="off"/>
               </w:rPr>
               <w:t xml:space="preserve">        x = self.conv_3(x)</w:t>
@@ -794,13 +859,15 @@
               <w:rPr>
                 <w:lang/>
                 <w:rFonts w:ascii="Consolas" w:hAnsi="Consolas"/>
-                <w:rtl w:val="off"/>
-              </w:rPr>
-            </w:pPr>
-            <w:r>
-              <w:rPr>
-                <w:lang/>
-                <w:rFonts w:ascii="Consolas" w:hAnsi="Consolas"/>
+                <w:color w:val="000000"/>
+                <w:rtl w:val="off"/>
+              </w:rPr>
+            </w:pPr>
+            <w:r>
+              <w:rPr>
+                <w:lang/>
+                <w:rFonts w:ascii="Consolas" w:hAnsi="Consolas"/>
+                <w:color w:val="000000"/>
                 <w:rtl w:val="off"/>
               </w:rPr>
               <w:t xml:space="preserve">        x = x.view(-1,256)</w:t>
@@ -812,13 +879,15 @@
               <w:rPr>
                 <w:lang/>
                 <w:rFonts w:ascii="Consolas" w:hAnsi="Consolas"/>
-                <w:rtl w:val="off"/>
-              </w:rPr>
-            </w:pPr>
-            <w:r>
-              <w:rPr>
-                <w:lang/>
-                <w:rFonts w:ascii="Consolas" w:hAnsi="Consolas"/>
+                <w:color w:val="000000"/>
+                <w:rtl w:val="off"/>
+              </w:rPr>
+            </w:pPr>
+            <w:r>
+              <w:rPr>
+                <w:lang/>
+                <w:rFonts w:ascii="Consolas" w:hAnsi="Consolas"/>
+                <w:color w:val="000000"/>
                 <w:rtl w:val="off"/>
               </w:rPr>
               <w:t xml:space="preserve">        x = self.fc_1(x)</w:t>
@@ -830,13 +899,15 @@
               <w:rPr>
                 <w:lang/>
                 <w:rFonts w:ascii="Consolas" w:hAnsi="Consolas"/>
-                <w:rtl w:val="off"/>
-              </w:rPr>
-            </w:pPr>
-            <w:r>
-              <w:rPr>
-                <w:lang/>
-                <w:rFonts w:ascii="Consolas" w:hAnsi="Consolas"/>
+                <w:color w:val="000000"/>
+                <w:rtl w:val="off"/>
+              </w:rPr>
+            </w:pPr>
+            <w:r>
+              <w:rPr>
+                <w:lang/>
+                <w:rFonts w:ascii="Consolas" w:hAnsi="Consolas"/>
+                <w:color w:val="000000"/>
                 <w:rtl w:val="off"/>
               </w:rPr>
               <w:t xml:space="preserve">        x = self.relu(x)</w:t>
@@ -848,13 +919,15 @@
               <w:rPr>
                 <w:lang/>
                 <w:rFonts w:ascii="Consolas" w:hAnsi="Consolas"/>
-                <w:rtl w:val="off"/>
-              </w:rPr>
-            </w:pPr>
-            <w:r>
-              <w:rPr>
-                <w:lang/>
-                <w:rFonts w:ascii="Consolas" w:hAnsi="Consolas"/>
+                <w:color w:val="000000"/>
+                <w:rtl w:val="off"/>
+              </w:rPr>
+            </w:pPr>
+            <w:r>
+              <w:rPr>
+                <w:lang/>
+                <w:rFonts w:ascii="Consolas" w:hAnsi="Consolas"/>
+                <w:color w:val="000000"/>
                 <w:rtl w:val="off"/>
               </w:rPr>
               <w:t xml:space="preserve">        res = self.fc_2(x)</w:t>
@@ -866,13 +939,15 @@
               <w:rPr>
                 <w:lang/>
                 <w:rFonts w:ascii="Consolas" w:hAnsi="Consolas"/>
-                <w:rtl w:val="off"/>
-              </w:rPr>
-            </w:pPr>
-            <w:r>
-              <w:rPr>
-                <w:lang/>
-                <w:rFonts w:ascii="Consolas" w:hAnsi="Consolas"/>
+                <w:color w:val="000000"/>
+                <w:rtl w:val="off"/>
+              </w:rPr>
+            </w:pPr>
+            <w:r>
+              <w:rPr>
+                <w:lang/>
+                <w:rFonts w:ascii="Consolas" w:hAnsi="Consolas"/>
+                <w:color w:val="000000"/>
                 <w:rtl w:val="off"/>
               </w:rPr>
               <w:t xml:space="preserve">        return res</w:t>
@@ -884,23 +959,26 @@
               <w:rPr>
                 <w:lang/>
                 <w:rFonts w:ascii="Consolas" w:hAnsi="Consolas"/>
-                <w:rtl w:val="off"/>
-              </w:rPr>
-            </w:pPr>
-          </w:p>
-          <w:p>
-            <w:pPr>
-              <w:spacing w:after="20" w:line="240" w:lineRule="auto"/>
-              <w:rPr>
-                <w:lang/>
-                <w:rFonts w:ascii="Consolas" w:hAnsi="Consolas"/>
-                <w:rtl w:val="off"/>
-              </w:rPr>
-            </w:pPr>
-            <w:r>
-              <w:rPr>
-                <w:lang/>
-                <w:rFonts w:ascii="Consolas" w:hAnsi="Consolas"/>
+                <w:color w:val="000000"/>
+                <w:rtl w:val="off"/>
+              </w:rPr>
+            </w:pPr>
+          </w:p>
+          <w:p>
+            <w:pPr>
+              <w:spacing w:after="20" w:line="240" w:lineRule="auto"/>
+              <w:rPr>
+                <w:lang/>
+                <w:rFonts w:ascii="Consolas" w:hAnsi="Consolas"/>
+                <w:color w:val="000000"/>
+                <w:rtl w:val="off"/>
+              </w:rPr>
+            </w:pPr>
+            <w:r>
+              <w:rPr>
+                <w:lang/>
+                <w:rFonts w:ascii="Consolas" w:hAnsi="Consolas"/>
+                <w:color w:val="000000"/>
                 <w:rtl w:val="off"/>
               </w:rPr>
               <w:t># ===== 수정 금지 =====</w:t>
@@ -912,13 +990,15 @@
               <w:rPr>
                 <w:lang/>
                 <w:rFonts w:ascii="Consolas" w:hAnsi="Consolas"/>
-                <w:rtl w:val="off"/>
-              </w:rPr>
-            </w:pPr>
-            <w:r>
-              <w:rPr>
-                <w:lang/>
-                <w:rFonts w:ascii="Consolas" w:hAnsi="Consolas"/>
+                <w:color w:val="000000"/>
+                <w:rtl w:val="off"/>
+              </w:rPr>
+            </w:pPr>
+            <w:r>
+              <w:rPr>
+                <w:lang/>
+                <w:rFonts w:ascii="Consolas" w:hAnsi="Consolas"/>
+                <w:color w:val="000000"/>
                 <w:rtl w:val="off"/>
               </w:rPr>
               <w:t>model_test = MyLeNet5_2()</w:t>
@@ -930,13 +1010,15 @@
               <w:rPr>
                 <w:lang/>
                 <w:rFonts w:ascii="Consolas" w:hAnsi="Consolas"/>
-                <w:rtl w:val="off"/>
-              </w:rPr>
-            </w:pPr>
-            <w:r>
-              <w:rPr>
-                <w:lang/>
-                <w:rFonts w:ascii="Consolas" w:hAnsi="Consolas"/>
+                <w:color w:val="000000"/>
+                <w:rtl w:val="off"/>
+              </w:rPr>
+            </w:pPr>
+            <w:r>
+              <w:rPr>
+                <w:lang/>
+                <w:rFonts w:ascii="Consolas" w:hAnsi="Consolas"/>
+                <w:color w:val="000000"/>
                 <w:rtl w:val="off"/>
               </w:rPr>
               <w:t>print(model_test)</w:t>
@@ -948,13 +1030,15 @@
               <w:rPr>
                 <w:lang/>
                 <w:rFonts w:ascii="Consolas" w:hAnsi="Consolas"/>
-                <w:rtl w:val="off"/>
-              </w:rPr>
-            </w:pPr>
-            <w:r>
-              <w:rPr>
-                <w:lang/>
-                <w:rFonts w:ascii="Consolas" w:hAnsi="Consolas"/>
+                <w:color w:val="000000"/>
+                <w:rtl w:val="off"/>
+              </w:rPr>
+            </w:pPr>
+            <w:r>
+              <w:rPr>
+                <w:lang/>
+                <w:rFonts w:ascii="Consolas" w:hAnsi="Consolas"/>
+                <w:color w:val="000000"/>
                 <w:rtl w:val="off"/>
               </w:rPr>
               <w:t>total_params = sum(p.numel() for p in model_test.parameters())</w:t>
@@ -966,13 +1050,15 @@
               <w:rPr>
                 <w:lang/>
                 <w:rFonts w:ascii="Consolas" w:hAnsi="Consolas"/>
-                <w:rtl w:val="off"/>
-              </w:rPr>
-            </w:pPr>
-            <w:r>
-              <w:rPr>
-                <w:lang/>
-                <w:rFonts w:ascii="Consolas" w:hAnsi="Consolas"/>
+                <w:color w:val="000000"/>
+                <w:rtl w:val="off"/>
+              </w:rPr>
+            </w:pPr>
+            <w:r>
+              <w:rPr>
+                <w:lang/>
+                <w:rFonts w:ascii="Consolas" w:hAnsi="Consolas"/>
+                <w:color w:val="000000"/>
                 <w:rtl w:val="off"/>
               </w:rPr>
               <w:t>print(f"파라미터 수: {total_params:,}개")</w:t>
@@ -984,13 +1070,15 @@
               <w:rPr>
                 <w:lang/>
                 <w:rFonts w:ascii="Consolas" w:hAnsi="Consolas"/>
-                <w:rtl w:val="off"/>
-              </w:rPr>
-            </w:pPr>
-            <w:r>
-              <w:rPr>
-                <w:lang/>
-                <w:rFonts w:ascii="Consolas" w:hAnsi="Consolas"/>
+                <w:color w:val="000000"/>
+                <w:rtl w:val="off"/>
+              </w:rPr>
+            </w:pPr>
+            <w:r>
+              <w:rPr>
+                <w:lang/>
+                <w:rFonts w:ascii="Consolas" w:hAnsi="Consolas"/>
+                <w:color w:val="000000"/>
                 <w:rtl w:val="off"/>
               </w:rPr>
               <w:t># ===== 수정 금지 끝 =====</w:t>
@@ -1002,23 +1090,26 @@
               <w:rPr>
                 <w:lang/>
                 <w:rFonts w:ascii="Consolas" w:hAnsi="Consolas"/>
-                <w:rtl w:val="off"/>
-              </w:rPr>
-            </w:pPr>
-          </w:p>
-          <w:p>
-            <w:pPr>
-              <w:spacing w:after="20" w:line="240" w:lineRule="auto"/>
-              <w:rPr>
-                <w:lang/>
-                <w:rFonts w:ascii="Consolas" w:hAnsi="Consolas"/>
-                <w:rtl w:val="off"/>
-              </w:rPr>
-            </w:pPr>
-            <w:r>
-              <w:rPr>
-                <w:lang/>
-                <w:rFonts w:ascii="Consolas" w:hAnsi="Consolas"/>
+                <w:color w:val="000000"/>
+                <w:rtl w:val="off"/>
+              </w:rPr>
+            </w:pPr>
+          </w:p>
+          <w:p>
+            <w:pPr>
+              <w:spacing w:after="20" w:line="240" w:lineRule="auto"/>
+              <w:rPr>
+                <w:lang/>
+                <w:rFonts w:ascii="Consolas" w:hAnsi="Consolas"/>
+                <w:color w:val="000000"/>
+                <w:rtl w:val="off"/>
+              </w:rPr>
+            </w:pPr>
+            <w:r>
+              <w:rPr>
+                <w:lang/>
+                <w:rFonts w:ascii="Consolas" w:hAnsi="Consolas"/>
+                <w:color w:val="000000"/>
                 <w:rtl w:val="off"/>
               </w:rPr>
               <w:t># TODO ③ : epochs 수정</w:t>
@@ -1030,13 +1121,15 @@
               <w:rPr>
                 <w:lang/>
                 <w:rFonts w:ascii="Consolas" w:hAnsi="Consolas"/>
-                <w:rtl w:val="off"/>
-              </w:rPr>
-            </w:pPr>
-            <w:r>
-              <w:rPr>
-                <w:lang/>
-                <w:rFonts w:ascii="Consolas" w:hAnsi="Consolas"/>
+                <w:color w:val="000000"/>
+                <w:rtl w:val="off"/>
+              </w:rPr>
+            </w:pPr>
+            <w:r>
+              <w:rPr>
+                <w:lang/>
+                <w:rFonts w:ascii="Consolas" w:hAnsi="Consolas"/>
+                <w:color w:val="000000"/>
                 <w:rtl w:val="off"/>
               </w:rPr>
               <w:t>epochs        = 3</w:t>
@@ -1048,13 +1141,15 @@
               <w:rPr>
                 <w:lang/>
                 <w:rFonts w:ascii="Consolas" w:hAnsi="Consolas"/>
-                <w:rtl w:val="off"/>
-              </w:rPr>
-            </w:pPr>
-            <w:r>
-              <w:rPr>
-                <w:lang/>
-                <w:rFonts w:ascii="Consolas" w:hAnsi="Consolas"/>
+                <w:color w:val="000000"/>
+                <w:rtl w:val="off"/>
+              </w:rPr>
+            </w:pPr>
+            <w:r>
+              <w:rPr>
+                <w:lang/>
+                <w:rFonts w:ascii="Consolas" w:hAnsi="Consolas"/>
+                <w:color w:val="000000"/>
                 <w:rtl w:val="off"/>
               </w:rPr>
               <w:t>learning_rate = 0.01</w:t>
@@ -1066,23 +1161,26 @@
               <w:rPr>
                 <w:lang/>
                 <w:rFonts w:ascii="Consolas" w:hAnsi="Consolas"/>
-                <w:rtl w:val="off"/>
-              </w:rPr>
-            </w:pPr>
-          </w:p>
-          <w:p>
-            <w:pPr>
-              <w:spacing w:after="20" w:line="240" w:lineRule="auto"/>
-              <w:rPr>
-                <w:lang/>
-                <w:rFonts w:ascii="Consolas" w:hAnsi="Consolas"/>
-                <w:rtl w:val="off"/>
-              </w:rPr>
-            </w:pPr>
-            <w:r>
-              <w:rPr>
-                <w:lang/>
-                <w:rFonts w:ascii="Consolas" w:hAnsi="Consolas"/>
+                <w:color w:val="000000"/>
+                <w:rtl w:val="off"/>
+              </w:rPr>
+            </w:pPr>
+          </w:p>
+          <w:p>
+            <w:pPr>
+              <w:spacing w:after="20" w:line="240" w:lineRule="auto"/>
+              <w:rPr>
+                <w:lang/>
+                <w:rFonts w:ascii="Consolas" w:hAnsi="Consolas"/>
+                <w:color w:val="000000"/>
+                <w:rtl w:val="off"/>
+              </w:rPr>
+            </w:pPr>
+            <w:r>
+              <w:rPr>
+                <w:lang/>
+                <w:rFonts w:ascii="Consolas" w:hAnsi="Consolas"/>
+                <w:color w:val="000000"/>
                 <w:rtl w:val="off"/>
               </w:rPr>
               <w:t># TODO ④ : 학번/이름 (필수)</w:t>
@@ -1094,13 +1192,15 @@
               <w:rPr>
                 <w:lang/>
                 <w:rFonts w:ascii="Consolas" w:hAnsi="Consolas"/>
-                <w:rtl w:val="off"/>
-              </w:rPr>
-            </w:pPr>
-            <w:r>
-              <w:rPr>
-                <w:lang/>
-                <w:rFonts w:ascii="Consolas" w:hAnsi="Consolas"/>
+                <w:color w:val="000000"/>
+                <w:rtl w:val="off"/>
+              </w:rPr>
+            </w:pPr>
+            <w:r>
+              <w:rPr>
+                <w:lang/>
+                <w:rFonts w:ascii="Consolas" w:hAnsi="Consolas"/>
+                <w:color w:val="000000"/>
                 <w:rtl w:val="off"/>
               </w:rPr>
               <w:t>STUDENT_ID   = "2021103635" #e.g., 20201111111</w:t>
@@ -1112,13 +1212,15 @@
               <w:rPr>
                 <w:lang/>
                 <w:rFonts w:ascii="Consolas" w:hAnsi="Consolas"/>
-                <w:rtl w:val="off"/>
-              </w:rPr>
-            </w:pPr>
-            <w:r>
-              <w:rPr>
-                <w:lang/>
-                <w:rFonts w:ascii="Consolas" w:hAnsi="Consolas"/>
+                <w:color w:val="000000"/>
+                <w:rtl w:val="off"/>
+              </w:rPr>
+            </w:pPr>
+            <w:r>
+              <w:rPr>
+                <w:lang/>
+                <w:rFonts w:ascii="Consolas" w:hAnsi="Consolas"/>
+                <w:color w:val="000000"/>
                 <w:rtl w:val="off"/>
               </w:rPr>
               <w:t>STUDENT_NAME = "LEE Min Seok" #e.g., Hong Gil Dong</w:t>
@@ -1130,23 +1232,26 @@
               <w:rPr>
                 <w:lang/>
                 <w:rFonts w:ascii="Consolas" w:hAnsi="Consolas"/>
-                <w:rtl w:val="off"/>
-              </w:rPr>
-            </w:pPr>
-          </w:p>
-          <w:p>
-            <w:pPr>
-              <w:spacing w:after="20" w:line="240" w:lineRule="auto"/>
-              <w:rPr>
-                <w:lang/>
-                <w:rFonts w:ascii="Consolas" w:hAnsi="Consolas"/>
-                <w:rtl w:val="off"/>
-              </w:rPr>
-            </w:pPr>
-            <w:r>
-              <w:rPr>
-                <w:lang/>
-                <w:rFonts w:ascii="Consolas" w:hAnsi="Consolas"/>
+                <w:color w:val="000000"/>
+                <w:rtl w:val="off"/>
+              </w:rPr>
+            </w:pPr>
+          </w:p>
+          <w:p>
+            <w:pPr>
+              <w:spacing w:after="20" w:line="240" w:lineRule="auto"/>
+              <w:rPr>
+                <w:lang/>
+                <w:rFonts w:ascii="Consolas" w:hAnsi="Consolas"/>
+                <w:color w:val="000000"/>
+                <w:rtl w:val="off"/>
+              </w:rPr>
+            </w:pPr>
+            <w:r>
+              <w:rPr>
+                <w:lang/>
+                <w:rFonts w:ascii="Consolas" w:hAnsi="Consolas"/>
+                <w:color w:val="000000"/>
                 <w:rtl w:val="off"/>
               </w:rPr>
               <w:t># ===== 수정 금지 =====</w:t>
@@ -1158,13 +1263,15 @@
               <w:rPr>
                 <w:lang/>
                 <w:rFonts w:ascii="Consolas" w:hAnsi="Consolas"/>
-                <w:rtl w:val="off"/>
-              </w:rPr>
-            </w:pPr>
-            <w:r>
-              <w:rPr>
-                <w:lang/>
-                <w:rFonts w:ascii="Consolas" w:hAnsi="Consolas"/>
+                <w:color w:val="000000"/>
+                <w:rtl w:val="off"/>
+              </w:rPr>
+            </w:pPr>
+            <w:r>
+              <w:rPr>
+                <w:lang/>
+                <w:rFonts w:ascii="Consolas" w:hAnsi="Consolas"/>
+                <w:color w:val="000000"/>
                 <w:rtl w:val="off"/>
               </w:rPr>
               <w:t>model         = MyLeNet5_2().to(device)</w:t>
@@ -1176,13 +1283,15 @@
               <w:rPr>
                 <w:lang/>
                 <w:rFonts w:ascii="Consolas" w:hAnsi="Consolas"/>
-                <w:rtl w:val="off"/>
-              </w:rPr>
-            </w:pPr>
-            <w:r>
-              <w:rPr>
-                <w:lang/>
-                <w:rFonts w:ascii="Consolas" w:hAnsi="Consolas"/>
+                <w:color w:val="000000"/>
+                <w:rtl w:val="off"/>
+              </w:rPr>
+            </w:pPr>
+            <w:r>
+              <w:rPr>
+                <w:lang/>
+                <w:rFonts w:ascii="Consolas" w:hAnsi="Consolas"/>
+                <w:color w:val="000000"/>
                 <w:rtl w:val="off"/>
               </w:rPr>
               <w:t>optimizer     = optim.Adadelta(model.parameters(), lr=learning_rate)</w:t>
@@ -1194,13 +1303,15 @@
               <w:rPr>
                 <w:lang/>
                 <w:rFonts w:ascii="Consolas" w:hAnsi="Consolas"/>
-                <w:rtl w:val="off"/>
-              </w:rPr>
-            </w:pPr>
-            <w:r>
-              <w:rPr>
-                <w:lang/>
-                <w:rFonts w:ascii="Consolas" w:hAnsi="Consolas"/>
+                <w:color w:val="000000"/>
+                <w:rtl w:val="off"/>
+              </w:rPr>
+            </w:pPr>
+            <w:r>
+              <w:rPr>
+                <w:lang/>
+                <w:rFonts w:ascii="Consolas" w:hAnsi="Consolas"/>
+                <w:color w:val="000000"/>
                 <w:rtl w:val="off"/>
               </w:rPr>
               <w:t>scheduler     = optim.lr_scheduler.StepLR(optimizer, step_size=1, gamma=0.1)</w:t>
@@ -1212,13 +1323,15 @@
               <w:rPr>
                 <w:lang/>
                 <w:rFonts w:ascii="Consolas" w:hAnsi="Consolas"/>
-                <w:rtl w:val="off"/>
-              </w:rPr>
-            </w:pPr>
-            <w:r>
-              <w:rPr>
-                <w:lang/>
-                <w:rFonts w:ascii="Consolas" w:hAnsi="Consolas"/>
+                <w:color w:val="000000"/>
+                <w:rtl w:val="off"/>
+              </w:rPr>
+            </w:pPr>
+            <w:r>
+              <w:rPr>
+                <w:lang/>
+                <w:rFonts w:ascii="Consolas" w:hAnsi="Consolas"/>
+                <w:color w:val="000000"/>
                 <w:rtl w:val="off"/>
               </w:rPr>
               <w:t>loss_function = nn.CrossEntropyLoss()</w:t>
@@ -1230,23 +1343,26 @@
               <w:rPr>
                 <w:lang/>
                 <w:rFonts w:ascii="Consolas" w:hAnsi="Consolas"/>
-                <w:rtl w:val="off"/>
-              </w:rPr>
-            </w:pPr>
-          </w:p>
-          <w:p>
-            <w:pPr>
-              <w:spacing w:after="20" w:line="240" w:lineRule="auto"/>
-              <w:rPr>
-                <w:lang/>
-                <w:rFonts w:ascii="Consolas" w:hAnsi="Consolas"/>
-                <w:rtl w:val="off"/>
-              </w:rPr>
-            </w:pPr>
-            <w:r>
-              <w:rPr>
-                <w:lang/>
-                <w:rFonts w:ascii="Consolas" w:hAnsi="Consolas"/>
+                <w:color w:val="000000"/>
+                <w:rtl w:val="off"/>
+              </w:rPr>
+            </w:pPr>
+          </w:p>
+          <w:p>
+            <w:pPr>
+              <w:spacing w:after="20" w:line="240" w:lineRule="auto"/>
+              <w:rPr>
+                <w:lang/>
+                <w:rFonts w:ascii="Consolas" w:hAnsi="Consolas"/>
+                <w:color w:val="000000"/>
+                <w:rtl w:val="off"/>
+              </w:rPr>
+            </w:pPr>
+            <w:r>
+              <w:rPr>
+                <w:lang/>
+                <w:rFonts w:ascii="Consolas" w:hAnsi="Consolas"/>
+                <w:color w:val="000000"/>
                 <w:rtl w:val="off"/>
               </w:rPr>
               <w:t>print(f"학번: {STUDENT_ID}  이름: {STUDENT_NAME}")</w:t>
@@ -1258,13 +1374,15 @@
               <w:rPr>
                 <w:lang/>
                 <w:rFonts w:ascii="Consolas" w:hAnsi="Consolas"/>
-                <w:rtl w:val="off"/>
-              </w:rPr>
-            </w:pPr>
-            <w:r>
-              <w:rPr>
-                <w:lang/>
-                <w:rFonts w:ascii="Consolas" w:hAnsi="Consolas"/>
+                <w:color w:val="000000"/>
+                <w:rtl w:val="off"/>
+              </w:rPr>
+            </w:pPr>
+            <w:r>
+              <w:rPr>
+                <w:lang/>
+                <w:rFonts w:ascii="Consolas" w:hAnsi="Consolas"/>
+                <w:color w:val="000000"/>
                 <w:rtl w:val="off"/>
               </w:rPr>
               <w:t>print(f"epochs={epochs}  lr={learning_rate}  optimizer=Adadelta")</w:t>
@@ -1275,12 +1393,14 @@
               <w:spacing w:after="20" w:line="240" w:lineRule="auto"/>
               <w:rPr>
                 <w:rFonts w:ascii="Consolas" w:hAnsi="Consolas"/>
-              </w:rPr>
-            </w:pPr>
-            <w:r>
-              <w:rPr>
-                <w:lang/>
-                <w:rFonts w:ascii="Consolas" w:hAnsi="Consolas"/>
+                <w:color w:val="000000"/>
+              </w:rPr>
+            </w:pPr>
+            <w:r>
+              <w:rPr>
+                <w:lang/>
+                <w:rFonts w:ascii="Consolas" w:hAnsi="Consolas"/>
+                <w:color w:val="000000"/>
                 <w:rtl w:val="off"/>
               </w:rPr>
               <w:t># ===== 수정 금지 끝 =====</w:t>
@@ -1775,17 +1895,6 @@
                 <w:sz w:val="20"/>
               </w:rPr>
             </w:pPr>
-          </w:p>
-          <w:p>
-            <w:pPr>
-              <w:spacing w:after="0" w:line="240" w:lineRule="auto"/>
-              <w:rPr>
-                <w:rFonts w:ascii="Arial" w:hAnsi="Arial" w:cs="Arial"/>
-                <w:b w:val="0"/>
-                <w:bCs w:val="0"/>
-                <w:sz w:val="20"/>
-              </w:rPr>
-            </w:pPr>
             <w:r>
               <w:rPr>
                 <w:rFonts w:ascii="Arial" w:hAnsi="Arial" w:cs="Arial"/>
@@ -1793,9 +1902,9 @@
               </w:rPr>
               <w:drawing>
                 <wp:inline distT="0" distB="0" distL="180" distR="180">
-                  <wp:extent cx="5731510" cy="3235960"/>
+                  <wp:extent cx="5731510" cy="3215640"/>
                   <wp:effectExtent l="0" t="0" r="0" b="0"/>
-                  <wp:docPr id="1027" name=""/>
+                  <wp:docPr id="1028" name=""/>
                   <wp:cNvGraphicFramePr>
                     <a:graphicFrameLocks xmlns:a="http://schemas.openxmlformats.org/drawingml/2006/main" noChangeAspect="1"/>
                   </wp:cNvGraphicFramePr>
@@ -1803,7 +1912,7 @@
                     <a:graphicData uri="http://schemas.openxmlformats.org/drawingml/2006/picture">
                       <pic:pic xmlns:pic="http://schemas.openxmlformats.org/drawingml/2006/picture">
                         <pic:nvPicPr>
-                          <pic:cNvPr id="1027" name=""/>
+                          <pic:cNvPr id="1028" name=""/>
                           <pic:cNvPicPr>
                             <a:picLocks noChangeAspect="1" noUngrp="1"/>
                           </pic:cNvPicPr>
@@ -1823,7 +1932,7 @@
                         <pic:spPr>
                           <a:xfrm>
                             <a:off x="0" y="0"/>
-                            <a:ext cx="5731510" cy="3235960"/>
+                            <a:ext cx="5731510" cy="3215640"/>
                           </a:xfrm>
                           <a:prstGeom prst="rect">
                             <a:avLst/>
@@ -1835,6 +1944,17 @@
                 </wp:inline>
               </w:drawing>
             </w:r>
+          </w:p>
+          <w:p>
+            <w:pPr>
+              <w:spacing w:after="0" w:line="240" w:lineRule="auto"/>
+              <w:rPr>
+                <w:rFonts w:ascii="Arial" w:hAnsi="Arial" w:cs="Arial"/>
+                <w:b w:val="0"/>
+                <w:bCs w:val="0"/>
+                <w:sz w:val="20"/>
+              </w:rPr>
+            </w:pPr>
           </w:p>
         </w:tc>
       </w:tr>
@@ -1918,162 +2038,24 @@
               <w:widowControl w:val="off"/>
               <w:spacing w:after="0" w:line="240" w:lineRule="auto"/>
               <w:rPr>
-                <w:rFonts w:ascii="Consolas" w:eastAsiaTheme="minorHAnsi" w:hAnsi="Consolas" w:cs="Consolas"/>
-                <w:b/>
-                <w:bCs/>
-                <w:color w:val="7F0055"/>
-                <w:sz w:val="20"/>
-              </w:rPr>
-            </w:pPr>
-            <w:r>
-              <w:rPr>
-                <w:rFonts w:ascii="Consolas" w:eastAsiaTheme="minorHAnsi" w:hAnsi="Consolas" w:cs="Consolas"/>
-                <w:b/>
-                <w:bCs/>
-                <w:color w:val="7F0055"/>
-                <w:sz w:val="20"/>
-              </w:rPr>
-              <w:t xml:space="preserve">// </w:t>
-            </w:r>
-            <w:r>
-              <w:rPr>
-                <w:rFonts w:ascii="Consolas" w:eastAsiaTheme="minorHAnsi" w:hAnsi="Consolas" w:cs="Consolas"/>
-                <w:b/>
-                <w:bCs/>
-                <w:color w:val="7F0055"/>
-                <w:sz w:val="20"/>
-              </w:rPr>
-              <w:t>아래</w:t>
-            </w:r>
-            <w:r>
-              <w:rPr>
-                <w:rFonts w:ascii="Consolas" w:eastAsiaTheme="minorHAnsi" w:hAnsi="Consolas" w:cs="Consolas"/>
-                <w:b/>
-                <w:bCs/>
-                <w:color w:val="7F0055"/>
-                <w:sz w:val="20"/>
-              </w:rPr>
-              <w:t xml:space="preserve"> </w:t>
-            </w:r>
-            <w:r>
-              <w:rPr>
-                <w:rFonts w:ascii="Consolas" w:eastAsiaTheme="minorHAnsi" w:hAnsi="Consolas" w:cs="Consolas"/>
-                <w:b/>
-                <w:bCs/>
-                <w:color w:val="7F0055"/>
-                <w:sz w:val="20"/>
-              </w:rPr>
-              <w:t>내용</w:t>
-            </w:r>
-            <w:r>
-              <w:rPr>
-                <w:rFonts w:ascii="Consolas" w:eastAsiaTheme="minorHAnsi" w:hAnsi="Consolas" w:cs="Consolas"/>
-                <w:b/>
-                <w:bCs/>
-                <w:color w:val="7F0055"/>
-                <w:sz w:val="20"/>
-              </w:rPr>
-              <w:t xml:space="preserve"> </w:t>
-            </w:r>
-            <w:r>
-              <w:rPr>
-                <w:rFonts w:ascii="Consolas" w:eastAsiaTheme="minorHAnsi" w:hAnsi="Consolas" w:cs="Consolas"/>
-                <w:b/>
-                <w:bCs/>
-                <w:color w:val="7F0055"/>
-                <w:sz w:val="20"/>
-              </w:rPr>
-              <w:t>삭제</w:t>
-            </w:r>
-            <w:r>
-              <w:rPr>
-                <w:rFonts w:ascii="Consolas" w:eastAsiaTheme="minorHAnsi" w:hAnsi="Consolas" w:cs="Consolas"/>
-                <w:b/>
-                <w:bCs/>
-                <w:color w:val="7F0055"/>
-                <w:sz w:val="20"/>
-              </w:rPr>
-              <w:t xml:space="preserve"> </w:t>
-            </w:r>
-            <w:r>
-              <w:rPr>
-                <w:rFonts w:ascii="Consolas" w:eastAsiaTheme="minorHAnsi" w:hAnsi="Consolas" w:cs="Consolas"/>
-                <w:b/>
-                <w:bCs/>
-                <w:color w:val="7F0055"/>
-                <w:sz w:val="20"/>
-              </w:rPr>
-              <w:t>후</w:t>
-            </w:r>
-            <w:r>
-              <w:rPr>
-                <w:rFonts w:ascii="Consolas" w:eastAsiaTheme="minorHAnsi" w:hAnsi="Consolas" w:cs="Consolas"/>
-                <w:b/>
-                <w:bCs/>
-                <w:color w:val="7F0055"/>
-                <w:sz w:val="20"/>
-              </w:rPr>
-              <w:t xml:space="preserve"> </w:t>
-            </w:r>
-            <w:r>
-              <w:rPr>
-                <w:rFonts w:ascii="Consolas" w:eastAsiaTheme="minorHAnsi" w:hAnsi="Consolas" w:cs="Consolas"/>
-                <w:b/>
-                <w:bCs/>
-                <w:color w:val="7F0055"/>
-                <w:sz w:val="20"/>
-              </w:rPr>
-              <w:t>본인</w:t>
-            </w:r>
-            <w:r>
-              <w:rPr>
-                <w:rFonts w:ascii="Consolas" w:eastAsiaTheme="minorHAnsi" w:hAnsi="Consolas" w:cs="Consolas"/>
-                <w:b/>
-                <w:bCs/>
-                <w:color w:val="7F0055"/>
-                <w:sz w:val="20"/>
-              </w:rPr>
-              <w:t xml:space="preserve"> </w:t>
-            </w:r>
-            <w:r>
-              <w:rPr>
-                <w:rFonts w:ascii="Consolas" w:eastAsiaTheme="minorHAnsi" w:hAnsi="Consolas" w:cs="Consolas"/>
-                <w:b/>
-                <w:bCs/>
-                <w:color w:val="7F0055"/>
-                <w:sz w:val="20"/>
-              </w:rPr>
-              <w:t>코드로</w:t>
-            </w:r>
-            <w:r>
-              <w:rPr>
-                <w:rFonts w:ascii="Consolas" w:eastAsiaTheme="minorHAnsi" w:hAnsi="Consolas" w:cs="Consolas"/>
-                <w:b/>
-                <w:bCs/>
-                <w:color w:val="7F0055"/>
-                <w:sz w:val="20"/>
-              </w:rPr>
-              <w:t xml:space="preserve"> </w:t>
-            </w:r>
-            <w:r>
-              <w:rPr>
-                <w:rFonts w:ascii="Consolas" w:eastAsiaTheme="minorHAnsi" w:hAnsi="Consolas" w:cs="Consolas"/>
-                <w:b/>
-                <w:bCs/>
-                <w:color w:val="7F0055"/>
-                <w:sz w:val="20"/>
-              </w:rPr>
-              <w:t>대체</w:t>
-            </w:r>
-            <w:r>
-              <w:rPr>
-                <w:rFonts w:ascii="Consolas" w:eastAsiaTheme="minorHAnsi" w:hAnsi="Consolas" w:cs="Consolas"/>
-                <w:b/>
-                <w:bCs/>
-                <w:color w:val="7F0055"/>
-                <w:sz w:val="20"/>
-              </w:rPr>
-              <w:t xml:space="preserve"> </w:t>
+                <w:rFonts w:ascii="Consolas" w:eastAsia="Consolas" w:hAnsi="Consolas" w:cs="Consolas"/>
+                <w:b w:val="0"/>
+                <w:bCs w:val="0"/>
+                <w:color w:val="000000"/>
+                <w:sz w:val="20"/>
+                <w:u w:color="auto"/>
+              </w:rPr>
+            </w:pPr>
+            <w:r>
+              <w:rPr>
+                <w:rFonts w:ascii="Consolas" w:eastAsia="Consolas" w:hAnsi="Consolas" w:cs="Consolas"/>
+                <w:b w:val="0"/>
+                <w:bCs w:val="0"/>
+                <w:color w:val="000000"/>
+                <w:sz w:val="20"/>
+                <w:u w:color="auto"/>
+              </w:rPr>
+              <w:t># TODO ① : 하이퍼파라미터 (변경표 참고)</w:t>
             </w:r>
           </w:p>
           <w:p>
@@ -2084,13 +2066,25 @@
               <w:widowControl w:val="off"/>
               <w:spacing w:after="0" w:line="240" w:lineRule="auto"/>
               <w:rPr>
-                <w:rFonts w:ascii="Consolas" w:eastAsiaTheme="minorHAnsi" w:hAnsi="Consolas" w:cs="Consolas"/>
-                <w:b/>
-                <w:bCs/>
-                <w:color w:val="7F0055"/>
-                <w:sz w:val="20"/>
-              </w:rPr>
-            </w:pPr>
+                <w:rFonts w:ascii="Consolas" w:eastAsia="Consolas" w:hAnsi="Consolas" w:cs="Consolas"/>
+                <w:b w:val="0"/>
+                <w:bCs w:val="0"/>
+                <w:color w:val="000000"/>
+                <w:sz w:val="20"/>
+                <w:u w:color="auto"/>
+              </w:rPr>
+            </w:pPr>
+            <w:r>
+              <w:rPr>
+                <w:rFonts w:ascii="Consolas" w:eastAsia="Consolas" w:hAnsi="Consolas" w:cs="Consolas"/>
+                <w:b w:val="0"/>
+                <w:bCs w:val="0"/>
+                <w:color w:val="000000"/>
+                <w:sz w:val="20"/>
+                <w:u w:color="auto"/>
+              </w:rPr>
+              <w:t>latent_size = 64          # 수정 금지</w:t>
+            </w:r>
           </w:p>
           <w:p>
             <w:pPr>
@@ -2100,28 +2094,24 @@
               <w:widowControl w:val="off"/>
               <w:spacing w:after="0" w:line="240" w:lineRule="auto"/>
               <w:rPr>
-                <w:rFonts w:ascii="Consolas" w:eastAsiaTheme="minorHAnsi" w:hAnsi="Consolas" w:cs="Consolas"/>
-                <w:color w:val="auto"/>
-                <w:sz w:val="20"/>
-              </w:rPr>
-            </w:pPr>
-            <w:r>
-              <w:rPr>
-                <w:rFonts w:ascii="Consolas" w:eastAsiaTheme="minorHAnsi" w:hAnsi="Consolas" w:cs="Consolas"/>
-                <w:b/>
-                <w:bCs/>
-                <w:color w:val="7F0055"/>
-                <w:sz w:val="20"/>
-              </w:rPr>
-              <w:t>import</w:t>
-            </w:r>
-            <w:r>
-              <w:rPr>
-                <w:rFonts w:ascii="Consolas" w:eastAsiaTheme="minorHAnsi" w:hAnsi="Consolas" w:cs="Consolas"/>
-                <w:color w:val="000000"/>
-                <w:sz w:val="20"/>
-              </w:rPr>
-              <w:t xml:space="preserve"> java.util.Scanner;</w:t>
+                <w:rFonts w:ascii="Consolas" w:eastAsia="Consolas" w:hAnsi="Consolas" w:cs="Consolas"/>
+                <w:b w:val="0"/>
+                <w:bCs w:val="0"/>
+                <w:color w:val="000000"/>
+                <w:sz w:val="20"/>
+                <w:u w:color="auto"/>
+              </w:rPr>
+            </w:pPr>
+            <w:r>
+              <w:rPr>
+                <w:rFonts w:ascii="Consolas" w:eastAsia="Consolas" w:hAnsi="Consolas" w:cs="Consolas"/>
+                <w:b w:val="0"/>
+                <w:bCs w:val="0"/>
+                <w:color w:val="000000"/>
+                <w:sz w:val="20"/>
+                <w:u w:color="auto"/>
+              </w:rPr>
+              <w:t>num_epochs  = 20         # ← 수정 대상</w:t>
             </w:r>
           </w:p>
           <w:p>
@@ -2132,11 +2122,25 @@
               <w:widowControl w:val="off"/>
               <w:spacing w:after="0" w:line="240" w:lineRule="auto"/>
               <w:rPr>
-                <w:rFonts w:ascii="Consolas" w:eastAsiaTheme="minorHAnsi" w:hAnsi="Consolas" w:cs="Consolas"/>
-                <w:color w:val="auto"/>
-                <w:sz w:val="20"/>
-              </w:rPr>
-            </w:pPr>
+                <w:rFonts w:ascii="Consolas" w:eastAsia="Consolas" w:hAnsi="Consolas" w:cs="Consolas"/>
+                <w:b w:val="0"/>
+                <w:bCs w:val="0"/>
+                <w:color w:val="000000"/>
+                <w:sz w:val="20"/>
+                <w:u w:color="auto"/>
+              </w:rPr>
+            </w:pPr>
+            <w:r>
+              <w:rPr>
+                <w:rFonts w:ascii="Consolas" w:eastAsia="Consolas" w:hAnsi="Consolas" w:cs="Consolas"/>
+                <w:b w:val="0"/>
+                <w:bCs w:val="0"/>
+                <w:color w:val="000000"/>
+                <w:sz w:val="20"/>
+                <w:u w:color="auto"/>
+              </w:rPr>
+              <w:t>batch_size  = 128         # ← 수정 대상</w:t>
+            </w:r>
           </w:p>
           <w:p>
             <w:pPr>
@@ -2146,46 +2150,24 @@
               <w:widowControl w:val="off"/>
               <w:spacing w:after="0" w:line="240" w:lineRule="auto"/>
               <w:rPr>
-                <w:rFonts w:ascii="Consolas" w:eastAsiaTheme="minorHAnsi" w:hAnsi="Consolas" w:cs="Consolas"/>
-                <w:color w:val="auto"/>
-                <w:sz w:val="20"/>
-              </w:rPr>
-            </w:pPr>
-            <w:r>
-              <w:rPr>
-                <w:rFonts w:ascii="Consolas" w:eastAsiaTheme="minorHAnsi" w:hAnsi="Consolas" w:cs="Consolas"/>
-                <w:b/>
-                <w:bCs/>
-                <w:color w:val="7F0055"/>
-                <w:sz w:val="20"/>
-              </w:rPr>
-              <w:t>public</w:t>
-            </w:r>
-            <w:r>
-              <w:rPr>
-                <w:rFonts w:ascii="Consolas" w:eastAsiaTheme="minorHAnsi" w:hAnsi="Consolas" w:cs="Consolas"/>
-                <w:color w:val="000000"/>
-                <w:sz w:val="20"/>
-              </w:rPr>
-              <w:t xml:space="preserve"> </w:t>
-            </w:r>
-            <w:r>
-              <w:rPr>
-                <w:rFonts w:ascii="Consolas" w:eastAsiaTheme="minorHAnsi" w:hAnsi="Consolas" w:cs="Consolas"/>
-                <w:b/>
-                <w:bCs/>
-                <w:color w:val="7F0055"/>
-                <w:sz w:val="20"/>
-              </w:rPr>
-              <w:t>class</w:t>
-            </w:r>
-            <w:r>
-              <w:rPr>
-                <w:rFonts w:ascii="Consolas" w:eastAsiaTheme="minorHAnsi" w:hAnsi="Consolas" w:cs="Consolas"/>
-                <w:color w:val="000000"/>
-                <w:sz w:val="20"/>
-              </w:rPr>
-              <w:t xml:space="preserve"> FirstProgram {</w:t>
+                <w:rFonts w:ascii="Consolas" w:eastAsia="Consolas" w:hAnsi="Consolas" w:cs="Consolas"/>
+                <w:b w:val="0"/>
+                <w:bCs w:val="0"/>
+                <w:color w:val="000000"/>
+                <w:sz w:val="20"/>
+                <w:u w:color="auto"/>
+              </w:rPr>
+            </w:pPr>
+            <w:r>
+              <w:rPr>
+                <w:rFonts w:ascii="Consolas" w:eastAsia="Consolas" w:hAnsi="Consolas" w:cs="Consolas"/>
+                <w:b w:val="0"/>
+                <w:bCs w:val="0"/>
+                <w:color w:val="000000"/>
+                <w:sz w:val="20"/>
+                <w:u w:color="auto"/>
+              </w:rPr>
+              <w:t>image_size  = 784         # 수정 금지</w:t>
             </w:r>
           </w:p>
           <w:p>
@@ -2196,9 +2178,12 @@
               <w:widowControl w:val="off"/>
               <w:spacing w:after="0" w:line="240" w:lineRule="auto"/>
               <w:rPr>
-                <w:rFonts w:ascii="Consolas" w:eastAsiaTheme="minorHAnsi" w:hAnsi="Consolas" w:cs="Consolas"/>
-                <w:color w:val="auto"/>
-                <w:sz w:val="20"/>
+                <w:rFonts w:ascii="Consolas" w:eastAsia="Consolas" w:hAnsi="Consolas" w:cs="Consolas"/>
+                <w:b w:val="0"/>
+                <w:bCs w:val="0"/>
+                <w:color w:val="000000"/>
+                <w:sz w:val="20"/>
+                <w:u w:color="auto"/>
               </w:rPr>
             </w:pPr>
           </w:p>
@@ -2210,25 +2195,945 @@
               <w:widowControl w:val="off"/>
               <w:spacing w:after="0" w:line="240" w:lineRule="auto"/>
               <w:rPr>
-                <w:rFonts w:ascii="Consolas" w:hAnsi="Consolas"/>
-              </w:rPr>
-            </w:pPr>
-            <w:r>
-              <w:rPr>
-                <w:rFonts w:ascii="Consolas" w:eastAsiaTheme="minorHAnsi" w:hAnsi="Consolas" w:cs="Consolas"/>
-                <w:color w:val="000000"/>
-                <w:sz w:val="20"/>
-              </w:rPr>
-              <w:tab/>
-            </w:r>
-          </w:p>
-          <w:p>
-            <w:pPr>
-              <w:spacing w:after="20" w:line="240" w:lineRule="auto"/>
-              <w:rPr>
-                <w:rFonts w:ascii="Consolas" w:hAnsi="Consolas"/>
-              </w:rPr>
-            </w:pPr>
+                <w:rFonts w:ascii="Consolas" w:eastAsia="Consolas" w:hAnsi="Consolas" w:cs="Consolas"/>
+                <w:b w:val="0"/>
+                <w:bCs w:val="0"/>
+                <w:color w:val="000000"/>
+                <w:sz w:val="20"/>
+                <w:u w:color="auto"/>
+              </w:rPr>
+            </w:pPr>
+            <w:r>
+              <w:rPr>
+                <w:rFonts w:ascii="Consolas" w:eastAsia="Consolas" w:hAnsi="Consolas" w:cs="Consolas"/>
+                <w:b w:val="0"/>
+                <w:bCs w:val="0"/>
+                <w:color w:val="000000"/>
+                <w:sz w:val="20"/>
+                <w:u w:color="auto"/>
+              </w:rPr>
+              <w:t># TODO ④ : 학번/이름 (필수)</w:t>
+            </w:r>
+          </w:p>
+          <w:p>
+            <w:pPr>
+              <w:adjustRightInd/>
+              <w:autoSpaceDE w:val="off"/>
+              <w:autoSpaceDN w:val="off"/>
+              <w:widowControl w:val="off"/>
+              <w:spacing w:after="0" w:line="240" w:lineRule="auto"/>
+              <w:rPr>
+                <w:rFonts w:ascii="Consolas" w:eastAsia="Consolas" w:hAnsi="Consolas" w:cs="Consolas"/>
+                <w:b w:val="0"/>
+                <w:bCs w:val="0"/>
+                <w:color w:val="000000"/>
+                <w:sz w:val="20"/>
+                <w:u w:color="auto"/>
+              </w:rPr>
+            </w:pPr>
+            <w:r>
+              <w:rPr>
+                <w:rFonts w:ascii="Consolas" w:eastAsia="Consolas" w:hAnsi="Consolas" w:cs="Consolas"/>
+                <w:b w:val="0"/>
+                <w:bCs w:val="0"/>
+                <w:color w:val="000000"/>
+                <w:sz w:val="20"/>
+                <w:u w:color="auto"/>
+              </w:rPr>
+              <w:t>STUDENT_ID   = "2021103635" # (e.g., 20000000000)</w:t>
+            </w:r>
+          </w:p>
+          <w:p>
+            <w:pPr>
+              <w:adjustRightInd/>
+              <w:autoSpaceDE w:val="off"/>
+              <w:autoSpaceDN w:val="off"/>
+              <w:widowControl w:val="off"/>
+              <w:spacing w:after="0" w:line="240" w:lineRule="auto"/>
+              <w:rPr>
+                <w:rFonts w:ascii="Consolas" w:eastAsia="Consolas" w:hAnsi="Consolas" w:cs="Consolas"/>
+                <w:b w:val="0"/>
+                <w:bCs w:val="0"/>
+                <w:color w:val="000000"/>
+                <w:sz w:val="20"/>
+                <w:u w:color="auto"/>
+              </w:rPr>
+            </w:pPr>
+            <w:r>
+              <w:rPr>
+                <w:rFonts w:ascii="Consolas" w:eastAsia="Consolas" w:hAnsi="Consolas" w:cs="Consolas"/>
+                <w:b w:val="0"/>
+                <w:bCs w:val="0"/>
+                <w:color w:val="000000"/>
+                <w:sz w:val="20"/>
+                <w:u w:color="auto"/>
+              </w:rPr>
+              <w:t>STUDENT_NAME = "LEE Min Seok" # (e.g., Hong Gil Dong)</w:t>
+            </w:r>
+          </w:p>
+          <w:p>
+            <w:pPr>
+              <w:adjustRightInd/>
+              <w:autoSpaceDE w:val="off"/>
+              <w:autoSpaceDN w:val="off"/>
+              <w:widowControl w:val="off"/>
+              <w:spacing w:after="0" w:line="240" w:lineRule="auto"/>
+              <w:rPr>
+                <w:rFonts w:ascii="Consolas" w:eastAsia="Consolas" w:hAnsi="Consolas" w:cs="Consolas"/>
+                <w:b w:val="0"/>
+                <w:bCs w:val="0"/>
+                <w:color w:val="000000"/>
+                <w:sz w:val="20"/>
+                <w:u w:color="auto"/>
+              </w:rPr>
+            </w:pPr>
+          </w:p>
+          <w:p>
+            <w:pPr>
+              <w:adjustRightInd/>
+              <w:autoSpaceDE w:val="off"/>
+              <w:autoSpaceDN w:val="off"/>
+              <w:widowControl w:val="off"/>
+              <w:spacing w:after="0" w:line="240" w:lineRule="auto"/>
+              <w:rPr>
+                <w:rFonts w:ascii="Consolas" w:eastAsia="Consolas" w:hAnsi="Consolas" w:cs="Consolas"/>
+                <w:b w:val="0"/>
+                <w:bCs w:val="0"/>
+                <w:color w:val="000000"/>
+                <w:sz w:val="20"/>
+                <w:u w:color="auto"/>
+              </w:rPr>
+            </w:pPr>
+            <w:r>
+              <w:rPr>
+                <w:rFonts w:ascii="Consolas" w:eastAsia="Consolas" w:hAnsi="Consolas" w:cs="Consolas"/>
+                <w:b w:val="0"/>
+                <w:bCs w:val="0"/>
+                <w:color w:val="000000"/>
+                <w:sz w:val="20"/>
+                <w:u w:color="auto"/>
+              </w:rPr>
+              <w:t># ===== 수정 금지 =====</w:t>
+            </w:r>
+          </w:p>
+          <w:p>
+            <w:pPr>
+              <w:adjustRightInd/>
+              <w:autoSpaceDE w:val="off"/>
+              <w:autoSpaceDN w:val="off"/>
+              <w:widowControl w:val="off"/>
+              <w:spacing w:after="0" w:line="240" w:lineRule="auto"/>
+              <w:rPr>
+                <w:rFonts w:ascii="Consolas" w:eastAsia="Consolas" w:hAnsi="Consolas" w:cs="Consolas"/>
+                <w:b w:val="0"/>
+                <w:bCs w:val="0"/>
+                <w:color w:val="000000"/>
+                <w:sz w:val="20"/>
+                <w:u w:color="auto"/>
+              </w:rPr>
+            </w:pPr>
+            <w:r>
+              <w:rPr>
+                <w:rFonts w:ascii="Consolas" w:eastAsia="Consolas" w:hAnsi="Consolas" w:cs="Consolas"/>
+                <w:b w:val="0"/>
+                <w:bCs w:val="0"/>
+                <w:color w:val="000000"/>
+                <w:sz w:val="20"/>
+                <w:u w:color="auto"/>
+              </w:rPr>
+              <w:t>print(f"latent_size={latent_size}  batch_size={batch_size}  num_epochs={num_epochs}")</w:t>
+            </w:r>
+          </w:p>
+          <w:p>
+            <w:pPr>
+              <w:adjustRightInd/>
+              <w:autoSpaceDE w:val="off"/>
+              <w:autoSpaceDN w:val="off"/>
+              <w:widowControl w:val="off"/>
+              <w:spacing w:after="0" w:line="240" w:lineRule="auto"/>
+              <w:rPr>
+                <w:rFonts w:ascii="Consolas" w:eastAsia="Consolas" w:hAnsi="Consolas" w:cs="Consolas"/>
+                <w:b w:val="0"/>
+                <w:bCs w:val="0"/>
+                <w:color w:val="000000"/>
+                <w:sz w:val="20"/>
+                <w:u w:color="auto"/>
+              </w:rPr>
+            </w:pPr>
+            <w:r>
+              <w:rPr>
+                <w:rFonts w:ascii="Consolas" w:eastAsia="Consolas" w:hAnsi="Consolas" w:cs="Consolas"/>
+                <w:b w:val="0"/>
+                <w:bCs w:val="0"/>
+                <w:color w:val="000000"/>
+                <w:sz w:val="20"/>
+                <w:u w:color="auto"/>
+              </w:rPr>
+              <w:t>print(f"학번: {STUDENT_ID}  이름: {STUDENT_NAME}")</w:t>
+            </w:r>
+          </w:p>
+          <w:p>
+            <w:pPr>
+              <w:adjustRightInd/>
+              <w:autoSpaceDE w:val="off"/>
+              <w:autoSpaceDN w:val="off"/>
+              <w:widowControl w:val="off"/>
+              <w:spacing w:after="0" w:line="240" w:lineRule="auto"/>
+              <w:rPr>
+                <w:rFonts w:ascii="Consolas" w:eastAsia="Consolas" w:hAnsi="Consolas" w:cs="Consolas"/>
+                <w:b/>
+                <w:bCs/>
+                <w:color w:val="000000"/>
+                <w:sz w:val="20"/>
+                <w:u w:color="auto"/>
+              </w:rPr>
+            </w:pPr>
+            <w:r>
+              <w:rPr>
+                <w:rFonts w:ascii="Consolas" w:eastAsia="Consolas" w:hAnsi="Consolas" w:cs="Consolas"/>
+                <w:b w:val="0"/>
+                <w:bCs w:val="0"/>
+                <w:color w:val="000000"/>
+                <w:sz w:val="20"/>
+                <w:u w:color="auto"/>
+              </w:rPr>
+              <w:t># ===== 수정 금지 끝 =====</w:t>
+            </w:r>
+          </w:p>
+          <w:p>
+            <w:pPr>
+              <w:adjustRightInd/>
+              <w:autoSpaceDE w:val="off"/>
+              <w:autoSpaceDN w:val="off"/>
+              <w:widowControl w:val="off"/>
+              <w:spacing w:after="0" w:line="240" w:lineRule="auto"/>
+              <w:rPr>
+                <w:rFonts w:ascii="Consolas" w:eastAsia="Consolas" w:hAnsi="Consolas" w:cs="Consolas"/>
+                <w:b/>
+                <w:bCs/>
+                <w:color w:val="000000"/>
+                <w:sz w:val="20"/>
+                <w:u w:color="auto"/>
+              </w:rPr>
+            </w:pPr>
+          </w:p>
+          <w:p>
+            <w:pPr>
+              <w:spacing w:after="20" w:line="240" w:lineRule="auto"/>
+              <w:rPr>
+                <w:lang/>
+                <w:rFonts w:ascii="Consolas" w:eastAsia="Consolas" w:hAnsi="Consolas" w:cs="Consolas"/>
+                <w:color w:val="000000"/>
+                <w:u w:color="auto"/>
+                <w:rtl w:val="off"/>
+              </w:rPr>
+            </w:pPr>
+          </w:p>
+          <w:p>
+            <w:pPr>
+              <w:spacing w:after="20" w:line="240" w:lineRule="auto"/>
+              <w:rPr>
+                <w:rFonts w:ascii="Consolas" w:eastAsia="Consolas" w:hAnsi="Consolas" w:cs="Consolas"/>
+                <w:color w:val="000000"/>
+                <w:u w:color="auto"/>
+              </w:rPr>
+            </w:pPr>
+            <w:r>
+              <w:rPr>
+                <w:rFonts w:ascii="Consolas" w:eastAsia="Consolas" w:hAnsi="Consolas" w:cs="Consolas"/>
+                <w:color w:val="000000"/>
+                <w:u w:color="auto"/>
+              </w:rPr>
+              <w:t># TODO ② : 수정된 Discriminator D</w:t>
+            </w:r>
+          </w:p>
+          <w:p>
+            <w:pPr>
+              <w:spacing w:after="20" w:line="240" w:lineRule="auto"/>
+              <w:rPr>
+                <w:rFonts w:ascii="Consolas" w:eastAsia="Consolas" w:hAnsi="Consolas" w:cs="Consolas"/>
+                <w:color w:val="000000"/>
+                <w:u w:color="auto"/>
+              </w:rPr>
+            </w:pPr>
+            <w:r>
+              <w:rPr>
+                <w:rFonts w:ascii="Consolas" w:eastAsia="Consolas" w:hAnsi="Consolas" w:cs="Consolas"/>
+                <w:color w:val="000000"/>
+                <w:u w:color="auto"/>
+              </w:rPr>
+              <w:t># 784 → 512 → 256 → 128 → 64 → 1</w:t>
+            </w:r>
+          </w:p>
+          <w:p>
+            <w:pPr>
+              <w:spacing w:after="20" w:line="240" w:lineRule="auto"/>
+              <w:rPr>
+                <w:rFonts w:ascii="Consolas" w:eastAsia="Consolas" w:hAnsi="Consolas" w:cs="Consolas"/>
+                <w:color w:val="000000"/>
+                <w:u w:color="auto"/>
+              </w:rPr>
+            </w:pPr>
+            <w:r>
+              <w:rPr>
+                <w:rFonts w:ascii="Consolas" w:eastAsia="Consolas" w:hAnsi="Consolas" w:cs="Consolas"/>
+                <w:color w:val="000000"/>
+                <w:u w:color="auto"/>
+              </w:rPr>
+              <w:t>D = nn.Sequential(</w:t>
+            </w:r>
+          </w:p>
+          <w:p>
+            <w:pPr>
+              <w:spacing w:after="20" w:line="240" w:lineRule="auto"/>
+              <w:rPr>
+                <w:rFonts w:ascii="Consolas" w:eastAsia="Consolas" w:hAnsi="Consolas" w:cs="Consolas"/>
+                <w:color w:val="000000"/>
+                <w:u w:color="auto"/>
+              </w:rPr>
+            </w:pPr>
+            <w:r>
+              <w:rPr>
+                <w:rFonts w:ascii="Consolas" w:eastAsia="Consolas" w:hAnsi="Consolas" w:cs="Consolas"/>
+                <w:color w:val="000000"/>
+                <w:u w:color="auto"/>
+              </w:rPr>
+              <w:t xml:space="preserve">    nn.Linear(784, 512),</w:t>
+            </w:r>
+          </w:p>
+          <w:p>
+            <w:pPr>
+              <w:spacing w:after="20" w:line="240" w:lineRule="auto"/>
+              <w:rPr>
+                <w:rFonts w:ascii="Consolas" w:eastAsia="Consolas" w:hAnsi="Consolas" w:cs="Consolas"/>
+                <w:color w:val="000000"/>
+                <w:u w:color="auto"/>
+              </w:rPr>
+            </w:pPr>
+            <w:r>
+              <w:rPr>
+                <w:rFonts w:ascii="Consolas" w:eastAsia="Consolas" w:hAnsi="Consolas" w:cs="Consolas"/>
+                <w:color w:val="000000"/>
+                <w:u w:color="auto"/>
+              </w:rPr>
+              <w:t xml:space="preserve">    nn.LeakyReLU(0.2),</w:t>
+            </w:r>
+          </w:p>
+          <w:p>
+            <w:pPr>
+              <w:spacing w:after="20" w:line="240" w:lineRule="auto"/>
+              <w:rPr>
+                <w:rFonts w:ascii="Consolas" w:eastAsia="Consolas" w:hAnsi="Consolas" w:cs="Consolas"/>
+                <w:color w:val="000000"/>
+                <w:u w:color="auto"/>
+              </w:rPr>
+            </w:pPr>
+            <w:r>
+              <w:rPr>
+                <w:rFonts w:ascii="Consolas" w:eastAsia="Consolas" w:hAnsi="Consolas" w:cs="Consolas"/>
+                <w:color w:val="000000"/>
+                <w:u w:color="auto"/>
+              </w:rPr>
+              <w:t xml:space="preserve">    nn.Linear(512, 256),</w:t>
+            </w:r>
+          </w:p>
+          <w:p>
+            <w:pPr>
+              <w:spacing w:after="20" w:line="240" w:lineRule="auto"/>
+              <w:rPr>
+                <w:rFonts w:ascii="Consolas" w:eastAsia="Consolas" w:hAnsi="Consolas" w:cs="Consolas"/>
+                <w:color w:val="000000"/>
+                <w:u w:color="auto"/>
+              </w:rPr>
+            </w:pPr>
+            <w:r>
+              <w:rPr>
+                <w:rFonts w:ascii="Consolas" w:eastAsia="Consolas" w:hAnsi="Consolas" w:cs="Consolas"/>
+                <w:color w:val="000000"/>
+                <w:u w:color="auto"/>
+              </w:rPr>
+              <w:t xml:space="preserve">    nn.LeakyReLU(0.2),</w:t>
+            </w:r>
+          </w:p>
+          <w:p>
+            <w:pPr>
+              <w:spacing w:after="20" w:line="240" w:lineRule="auto"/>
+              <w:rPr>
+                <w:rFonts w:ascii="Consolas" w:eastAsia="Consolas" w:hAnsi="Consolas" w:cs="Consolas"/>
+                <w:color w:val="000000"/>
+                <w:u w:color="auto"/>
+              </w:rPr>
+            </w:pPr>
+            <w:r>
+              <w:rPr>
+                <w:rFonts w:ascii="Consolas" w:eastAsia="Consolas" w:hAnsi="Consolas" w:cs="Consolas"/>
+                <w:color w:val="000000"/>
+                <w:u w:color="auto"/>
+              </w:rPr>
+              <w:t xml:space="preserve">    nn.Linear(256, 128),</w:t>
+            </w:r>
+          </w:p>
+          <w:p>
+            <w:pPr>
+              <w:spacing w:after="20" w:line="240" w:lineRule="auto"/>
+              <w:rPr>
+                <w:rFonts w:ascii="Consolas" w:eastAsia="Consolas" w:hAnsi="Consolas" w:cs="Consolas"/>
+                <w:color w:val="000000"/>
+                <w:u w:color="auto"/>
+              </w:rPr>
+            </w:pPr>
+            <w:r>
+              <w:rPr>
+                <w:rFonts w:ascii="Consolas" w:eastAsia="Consolas" w:hAnsi="Consolas" w:cs="Consolas"/>
+                <w:color w:val="000000"/>
+                <w:u w:color="auto"/>
+              </w:rPr>
+              <w:t xml:space="preserve">    nn.LeakyReLU(0.2),</w:t>
+            </w:r>
+          </w:p>
+          <w:p>
+            <w:pPr>
+              <w:spacing w:after="20" w:line="240" w:lineRule="auto"/>
+              <w:rPr>
+                <w:rFonts w:ascii="Consolas" w:eastAsia="Consolas" w:hAnsi="Consolas" w:cs="Consolas"/>
+                <w:color w:val="000000"/>
+                <w:u w:color="auto"/>
+              </w:rPr>
+            </w:pPr>
+            <w:r>
+              <w:rPr>
+                <w:rFonts w:ascii="Consolas" w:eastAsia="Consolas" w:hAnsi="Consolas" w:cs="Consolas"/>
+                <w:color w:val="000000"/>
+                <w:u w:color="auto"/>
+              </w:rPr>
+              <w:t xml:space="preserve">    nn.Linear(128, 64),</w:t>
+            </w:r>
+          </w:p>
+          <w:p>
+            <w:pPr>
+              <w:spacing w:after="20" w:line="240" w:lineRule="auto"/>
+              <w:rPr>
+                <w:rFonts w:ascii="Consolas" w:eastAsia="Consolas" w:hAnsi="Consolas" w:cs="Consolas"/>
+                <w:color w:val="000000"/>
+                <w:u w:color="auto"/>
+              </w:rPr>
+            </w:pPr>
+            <w:r>
+              <w:rPr>
+                <w:rFonts w:ascii="Consolas" w:eastAsia="Consolas" w:hAnsi="Consolas" w:cs="Consolas"/>
+                <w:color w:val="000000"/>
+                <w:u w:color="auto"/>
+              </w:rPr>
+              <w:t xml:space="preserve">    nn.LeakyReLU(0.2),</w:t>
+            </w:r>
+          </w:p>
+          <w:p>
+            <w:pPr>
+              <w:spacing w:after="20" w:line="240" w:lineRule="auto"/>
+              <w:rPr>
+                <w:rFonts w:ascii="Consolas" w:eastAsia="Consolas" w:hAnsi="Consolas" w:cs="Consolas"/>
+                <w:color w:val="000000"/>
+                <w:u w:color="auto"/>
+              </w:rPr>
+            </w:pPr>
+            <w:r>
+              <w:rPr>
+                <w:rFonts w:ascii="Consolas" w:eastAsia="Consolas" w:hAnsi="Consolas" w:cs="Consolas"/>
+                <w:color w:val="000000"/>
+                <w:u w:color="auto"/>
+              </w:rPr>
+              <w:t xml:space="preserve">    nn.Linear(64, 1),</w:t>
+            </w:r>
+          </w:p>
+          <w:p>
+            <w:pPr>
+              <w:spacing w:after="20" w:line="240" w:lineRule="auto"/>
+              <w:rPr>
+                <w:rFonts w:ascii="Consolas" w:eastAsia="Consolas" w:hAnsi="Consolas" w:cs="Consolas"/>
+                <w:color w:val="000000"/>
+                <w:u w:color="auto"/>
+              </w:rPr>
+            </w:pPr>
+            <w:r>
+              <w:rPr>
+                <w:rFonts w:ascii="Consolas" w:eastAsia="Consolas" w:hAnsi="Consolas" w:cs="Consolas"/>
+                <w:color w:val="000000"/>
+                <w:u w:color="auto"/>
+              </w:rPr>
+              <w:t xml:space="preserve">    nn.Sigmoid())    # ← nn.Sequential(...) 로 교체하세요</w:t>
+            </w:r>
+          </w:p>
+          <w:p>
+            <w:pPr>
+              <w:spacing w:after="20" w:line="240" w:lineRule="auto"/>
+              <w:rPr>
+                <w:rFonts w:ascii="Consolas" w:eastAsia="Consolas" w:hAnsi="Consolas" w:cs="Consolas"/>
+                <w:color w:val="000000"/>
+                <w:u w:color="auto"/>
+              </w:rPr>
+            </w:pPr>
+          </w:p>
+          <w:p>
+            <w:pPr>
+              <w:spacing w:after="20" w:line="240" w:lineRule="auto"/>
+              <w:rPr>
+                <w:rFonts w:ascii="Consolas" w:eastAsia="Consolas" w:hAnsi="Consolas" w:cs="Consolas"/>
+                <w:color w:val="000000"/>
+                <w:u w:color="auto"/>
+              </w:rPr>
+            </w:pPr>
+            <w:r>
+              <w:rPr>
+                <w:rFonts w:ascii="Consolas" w:eastAsia="Consolas" w:hAnsi="Consolas" w:cs="Consolas"/>
+                <w:color w:val="000000"/>
+                <w:u w:color="auto"/>
+              </w:rPr>
+              <w:t># TODO ③ : 수정된 Generator G</w:t>
+            </w:r>
+          </w:p>
+          <w:p>
+            <w:pPr>
+              <w:spacing w:after="20" w:line="240" w:lineRule="auto"/>
+              <w:rPr>
+                <w:rFonts w:ascii="Consolas" w:eastAsia="Consolas" w:hAnsi="Consolas" w:cs="Consolas"/>
+                <w:color w:val="000000"/>
+                <w:u w:color="auto"/>
+              </w:rPr>
+            </w:pPr>
+            <w:r>
+              <w:rPr>
+                <w:rFonts w:ascii="Consolas" w:eastAsia="Consolas" w:hAnsi="Consolas" w:cs="Consolas"/>
+                <w:color w:val="000000"/>
+                <w:u w:color="auto"/>
+              </w:rPr>
+              <w:t># 64 → 256 → 512 → 256 → 128 → 784</w:t>
+            </w:r>
+          </w:p>
+          <w:p>
+            <w:pPr>
+              <w:spacing w:after="20" w:line="240" w:lineRule="auto"/>
+              <w:rPr>
+                <w:rFonts w:ascii="Consolas" w:eastAsia="Consolas" w:hAnsi="Consolas" w:cs="Consolas"/>
+                <w:color w:val="000000"/>
+                <w:u w:color="auto"/>
+              </w:rPr>
+            </w:pPr>
+            <w:r>
+              <w:rPr>
+                <w:rFonts w:ascii="Consolas" w:eastAsia="Consolas" w:hAnsi="Consolas" w:cs="Consolas"/>
+                <w:color w:val="000000"/>
+                <w:u w:color="auto"/>
+              </w:rPr>
+              <w:t>G = nn.Sequential(</w:t>
+            </w:r>
+          </w:p>
+          <w:p>
+            <w:pPr>
+              <w:spacing w:after="20" w:line="240" w:lineRule="auto"/>
+              <w:rPr>
+                <w:rFonts w:ascii="Consolas" w:eastAsia="Consolas" w:hAnsi="Consolas" w:cs="Consolas"/>
+                <w:color w:val="000000"/>
+                <w:u w:color="auto"/>
+              </w:rPr>
+            </w:pPr>
+            <w:r>
+              <w:rPr>
+                <w:rFonts w:ascii="Consolas" w:eastAsia="Consolas" w:hAnsi="Consolas" w:cs="Consolas"/>
+                <w:color w:val="000000"/>
+                <w:u w:color="auto"/>
+              </w:rPr>
+              <w:t xml:space="preserve">    nn.Linear(64, 256),</w:t>
+            </w:r>
+          </w:p>
+          <w:p>
+            <w:pPr>
+              <w:spacing w:after="20" w:line="240" w:lineRule="auto"/>
+              <w:rPr>
+                <w:rFonts w:ascii="Consolas" w:eastAsia="Consolas" w:hAnsi="Consolas" w:cs="Consolas"/>
+                <w:color w:val="000000"/>
+                <w:u w:color="auto"/>
+              </w:rPr>
+            </w:pPr>
+            <w:r>
+              <w:rPr>
+                <w:rFonts w:ascii="Consolas" w:eastAsia="Consolas" w:hAnsi="Consolas" w:cs="Consolas"/>
+                <w:color w:val="000000"/>
+                <w:u w:color="auto"/>
+              </w:rPr>
+              <w:t xml:space="preserve">    nn.ReLU(),</w:t>
+            </w:r>
+          </w:p>
+          <w:p>
+            <w:pPr>
+              <w:spacing w:after="20" w:line="240" w:lineRule="auto"/>
+              <w:rPr>
+                <w:rFonts w:ascii="Consolas" w:eastAsia="Consolas" w:hAnsi="Consolas" w:cs="Consolas"/>
+                <w:color w:val="000000"/>
+                <w:u w:color="auto"/>
+              </w:rPr>
+            </w:pPr>
+            <w:r>
+              <w:rPr>
+                <w:rFonts w:ascii="Consolas" w:eastAsia="Consolas" w:hAnsi="Consolas" w:cs="Consolas"/>
+                <w:color w:val="000000"/>
+                <w:u w:color="auto"/>
+              </w:rPr>
+              <w:t xml:space="preserve">    nn.Linear(256, 512),</w:t>
+            </w:r>
+          </w:p>
+          <w:p>
+            <w:pPr>
+              <w:spacing w:after="20" w:line="240" w:lineRule="auto"/>
+              <w:rPr>
+                <w:rFonts w:ascii="Consolas" w:eastAsia="Consolas" w:hAnsi="Consolas" w:cs="Consolas"/>
+                <w:color w:val="000000"/>
+                <w:u w:color="auto"/>
+              </w:rPr>
+            </w:pPr>
+            <w:r>
+              <w:rPr>
+                <w:rFonts w:ascii="Consolas" w:eastAsia="Consolas" w:hAnsi="Consolas" w:cs="Consolas"/>
+                <w:color w:val="000000"/>
+                <w:u w:color="auto"/>
+              </w:rPr>
+              <w:t xml:space="preserve">    nn.ReLU(),</w:t>
+            </w:r>
+          </w:p>
+          <w:p>
+            <w:pPr>
+              <w:spacing w:after="20" w:line="240" w:lineRule="auto"/>
+              <w:rPr>
+                <w:rFonts w:ascii="Consolas" w:eastAsia="Consolas" w:hAnsi="Consolas" w:cs="Consolas"/>
+                <w:color w:val="000000"/>
+                <w:u w:color="auto"/>
+              </w:rPr>
+            </w:pPr>
+            <w:r>
+              <w:rPr>
+                <w:rFonts w:ascii="Consolas" w:eastAsia="Consolas" w:hAnsi="Consolas" w:cs="Consolas"/>
+                <w:color w:val="000000"/>
+                <w:u w:color="auto"/>
+              </w:rPr>
+              <w:t xml:space="preserve">    nn.Linear(512, 256),</w:t>
+            </w:r>
+          </w:p>
+          <w:p>
+            <w:pPr>
+              <w:spacing w:after="20" w:line="240" w:lineRule="auto"/>
+              <w:rPr>
+                <w:rFonts w:ascii="Consolas" w:eastAsia="Consolas" w:hAnsi="Consolas" w:cs="Consolas"/>
+                <w:color w:val="000000"/>
+                <w:u w:color="auto"/>
+              </w:rPr>
+            </w:pPr>
+            <w:r>
+              <w:rPr>
+                <w:rFonts w:ascii="Consolas" w:eastAsia="Consolas" w:hAnsi="Consolas" w:cs="Consolas"/>
+                <w:color w:val="000000"/>
+                <w:u w:color="auto"/>
+              </w:rPr>
+              <w:t xml:space="preserve">    nn.ReLU(),</w:t>
+            </w:r>
+          </w:p>
+          <w:p>
+            <w:pPr>
+              <w:spacing w:after="20" w:line="240" w:lineRule="auto"/>
+              <w:rPr>
+                <w:rFonts w:ascii="Consolas" w:eastAsia="Consolas" w:hAnsi="Consolas" w:cs="Consolas"/>
+                <w:color w:val="000000"/>
+                <w:u w:color="auto"/>
+              </w:rPr>
+            </w:pPr>
+            <w:r>
+              <w:rPr>
+                <w:rFonts w:ascii="Consolas" w:eastAsia="Consolas" w:hAnsi="Consolas" w:cs="Consolas"/>
+                <w:color w:val="000000"/>
+                <w:u w:color="auto"/>
+              </w:rPr>
+              <w:t xml:space="preserve">    nn.Linear(256, 128),</w:t>
+            </w:r>
+          </w:p>
+          <w:p>
+            <w:pPr>
+              <w:spacing w:after="20" w:line="240" w:lineRule="auto"/>
+              <w:rPr>
+                <w:rFonts w:ascii="Consolas" w:eastAsia="Consolas" w:hAnsi="Consolas" w:cs="Consolas"/>
+                <w:color w:val="000000"/>
+                <w:u w:color="auto"/>
+              </w:rPr>
+            </w:pPr>
+            <w:r>
+              <w:rPr>
+                <w:rFonts w:ascii="Consolas" w:eastAsia="Consolas" w:hAnsi="Consolas" w:cs="Consolas"/>
+                <w:color w:val="000000"/>
+                <w:u w:color="auto"/>
+              </w:rPr>
+              <w:t xml:space="preserve">    nn.ReLU(),</w:t>
+            </w:r>
+          </w:p>
+          <w:p>
+            <w:pPr>
+              <w:spacing w:after="20" w:line="240" w:lineRule="auto"/>
+              <w:rPr>
+                <w:rFonts w:ascii="Consolas" w:eastAsia="Consolas" w:hAnsi="Consolas" w:cs="Consolas"/>
+                <w:color w:val="000000"/>
+                <w:u w:color="auto"/>
+              </w:rPr>
+            </w:pPr>
+            <w:r>
+              <w:rPr>
+                <w:rFonts w:ascii="Consolas" w:eastAsia="Consolas" w:hAnsi="Consolas" w:cs="Consolas"/>
+                <w:color w:val="000000"/>
+                <w:u w:color="auto"/>
+              </w:rPr>
+              <w:t xml:space="preserve">    nn.Linear(128, 784),</w:t>
+            </w:r>
+          </w:p>
+          <w:p>
+            <w:pPr>
+              <w:spacing w:after="20" w:line="240" w:lineRule="auto"/>
+              <w:rPr>
+                <w:rFonts w:ascii="Consolas" w:eastAsia="Consolas" w:hAnsi="Consolas" w:cs="Consolas"/>
+                <w:color w:val="000000"/>
+                <w:u w:color="auto"/>
+              </w:rPr>
+            </w:pPr>
+            <w:r>
+              <w:rPr>
+                <w:rFonts w:ascii="Consolas" w:eastAsia="Consolas" w:hAnsi="Consolas" w:cs="Consolas"/>
+                <w:color w:val="000000"/>
+                <w:u w:color="auto"/>
+              </w:rPr>
+              <w:t xml:space="preserve">    nn.Tanh())    # ← nn.Sequential(...) 로 교체하세요</w:t>
+            </w:r>
+          </w:p>
+          <w:p>
+            <w:pPr>
+              <w:spacing w:after="20" w:line="240" w:lineRule="auto"/>
+              <w:rPr>
+                <w:rFonts w:ascii="Consolas" w:eastAsia="Consolas" w:hAnsi="Consolas" w:cs="Consolas"/>
+                <w:color w:val="000000"/>
+                <w:u w:color="auto"/>
+              </w:rPr>
+            </w:pPr>
+          </w:p>
+          <w:p>
+            <w:pPr>
+              <w:spacing w:after="20" w:line="240" w:lineRule="auto"/>
+              <w:rPr>
+                <w:rFonts w:ascii="Consolas" w:eastAsia="Consolas" w:hAnsi="Consolas" w:cs="Consolas"/>
+                <w:color w:val="000000"/>
+                <w:u w:color="auto"/>
+              </w:rPr>
+            </w:pPr>
+            <w:r>
+              <w:rPr>
+                <w:rFonts w:ascii="Consolas" w:eastAsia="Consolas" w:hAnsi="Consolas" w:cs="Consolas"/>
+                <w:color w:val="000000"/>
+                <w:u w:color="auto"/>
+              </w:rPr>
+              <w:t># ===== 수정 금지 =====</w:t>
+            </w:r>
+          </w:p>
+          <w:p>
+            <w:pPr>
+              <w:spacing w:after="20" w:line="240" w:lineRule="auto"/>
+              <w:rPr>
+                <w:rFonts w:ascii="Consolas" w:eastAsia="Consolas" w:hAnsi="Consolas" w:cs="Consolas"/>
+                <w:color w:val="000000"/>
+                <w:u w:color="auto"/>
+              </w:rPr>
+            </w:pPr>
+            <w:r>
+              <w:rPr>
+                <w:rFonts w:ascii="Consolas" w:eastAsia="Consolas" w:hAnsi="Consolas" w:cs="Consolas"/>
+                <w:color w:val="000000"/>
+                <w:u w:color="auto"/>
+              </w:rPr>
+              <w:t>D = D.to(device)</w:t>
+            </w:r>
+          </w:p>
+          <w:p>
+            <w:pPr>
+              <w:spacing w:after="20" w:line="240" w:lineRule="auto"/>
+              <w:rPr>
+                <w:rFonts w:ascii="Consolas" w:eastAsia="Consolas" w:hAnsi="Consolas" w:cs="Consolas"/>
+                <w:color w:val="000000"/>
+                <w:u w:color="auto"/>
+              </w:rPr>
+            </w:pPr>
+            <w:r>
+              <w:rPr>
+                <w:rFonts w:ascii="Consolas" w:eastAsia="Consolas" w:hAnsi="Consolas" w:cs="Consolas"/>
+                <w:color w:val="000000"/>
+                <w:u w:color="auto"/>
+              </w:rPr>
+              <w:t>G = G.to(device)</w:t>
+            </w:r>
+          </w:p>
+          <w:p>
+            <w:pPr>
+              <w:spacing w:after="20" w:line="240" w:lineRule="auto"/>
+              <w:rPr>
+                <w:rFonts w:ascii="Consolas" w:eastAsia="Consolas" w:hAnsi="Consolas" w:cs="Consolas"/>
+                <w:color w:val="000000"/>
+                <w:u w:color="auto"/>
+              </w:rPr>
+            </w:pPr>
+          </w:p>
+          <w:p>
+            <w:pPr>
+              <w:spacing w:after="20" w:line="240" w:lineRule="auto"/>
+              <w:rPr>
+                <w:rFonts w:ascii="Consolas" w:eastAsia="Consolas" w:hAnsi="Consolas" w:cs="Consolas"/>
+                <w:color w:val="000000"/>
+                <w:u w:color="auto"/>
+              </w:rPr>
+            </w:pPr>
+            <w:r>
+              <w:rPr>
+                <w:rFonts w:ascii="Consolas" w:eastAsia="Consolas" w:hAnsi="Consolas" w:cs="Consolas"/>
+                <w:color w:val="000000"/>
+                <w:u w:color="auto"/>
+              </w:rPr>
+              <w:t>criterion   = nn.BCELoss()</w:t>
+            </w:r>
+          </w:p>
+          <w:p>
+            <w:pPr>
+              <w:spacing w:after="20" w:line="240" w:lineRule="auto"/>
+              <w:rPr>
+                <w:rFonts w:ascii="Consolas" w:eastAsia="Consolas" w:hAnsi="Consolas" w:cs="Consolas"/>
+                <w:color w:val="000000"/>
+                <w:u w:color="auto"/>
+              </w:rPr>
+            </w:pPr>
+            <w:r>
+              <w:rPr>
+                <w:rFonts w:ascii="Consolas" w:eastAsia="Consolas" w:hAnsi="Consolas" w:cs="Consolas"/>
+                <w:color w:val="000000"/>
+                <w:u w:color="auto"/>
+              </w:rPr>
+              <w:t>d_optimizer = torch.optim.Adam(D.parameters(), lr=0.0002)</w:t>
+            </w:r>
+          </w:p>
+          <w:p>
+            <w:pPr>
+              <w:spacing w:after="20" w:line="240" w:lineRule="auto"/>
+              <w:rPr>
+                <w:rFonts w:ascii="Consolas" w:eastAsia="Consolas" w:hAnsi="Consolas" w:cs="Consolas"/>
+                <w:color w:val="000000"/>
+                <w:u w:color="auto"/>
+              </w:rPr>
+            </w:pPr>
+            <w:r>
+              <w:rPr>
+                <w:rFonts w:ascii="Consolas" w:eastAsia="Consolas" w:hAnsi="Consolas" w:cs="Consolas"/>
+                <w:color w:val="000000"/>
+                <w:u w:color="auto"/>
+              </w:rPr>
+              <w:t>g_optimizer = torch.optim.Adam(G.parameters(), lr=0.0002)</w:t>
+            </w:r>
+          </w:p>
+          <w:p>
+            <w:pPr>
+              <w:spacing w:after="20" w:line="240" w:lineRule="auto"/>
+              <w:rPr>
+                <w:rFonts w:ascii="Consolas" w:eastAsia="Consolas" w:hAnsi="Consolas" w:cs="Consolas"/>
+                <w:color w:val="000000"/>
+                <w:u w:color="auto"/>
+              </w:rPr>
+            </w:pPr>
+          </w:p>
+          <w:p>
+            <w:pPr>
+              <w:spacing w:after="20" w:line="240" w:lineRule="auto"/>
+              <w:rPr>
+                <w:rFonts w:ascii="Consolas" w:eastAsia="Consolas" w:hAnsi="Consolas" w:cs="Consolas"/>
+                <w:color w:val="000000"/>
+                <w:u w:color="auto"/>
+              </w:rPr>
+            </w:pPr>
+            <w:r>
+              <w:rPr>
+                <w:rFonts w:ascii="Consolas" w:eastAsia="Consolas" w:hAnsi="Consolas" w:cs="Consolas"/>
+                <w:color w:val="000000"/>
+                <w:u w:color="auto"/>
+              </w:rPr>
+              <w:t>print("D 파라미터:", sum(p.numel() for p in D.parameters()), "개")</w:t>
+            </w:r>
+          </w:p>
+          <w:p>
+            <w:pPr>
+              <w:spacing w:after="20" w:line="240" w:lineRule="auto"/>
+              <w:rPr>
+                <w:rFonts w:ascii="Consolas" w:eastAsia="Consolas" w:hAnsi="Consolas" w:cs="Consolas"/>
+                <w:color w:val="000000"/>
+                <w:u w:color="auto"/>
+              </w:rPr>
+            </w:pPr>
+            <w:r>
+              <w:rPr>
+                <w:rFonts w:ascii="Consolas" w:eastAsia="Consolas" w:hAnsi="Consolas" w:cs="Consolas"/>
+                <w:color w:val="000000"/>
+                <w:u w:color="auto"/>
+              </w:rPr>
+              <w:t>print("G 파라미터:", sum(p.numel() for p in G.parameters()), "개")</w:t>
+            </w:r>
+          </w:p>
+          <w:p>
+            <w:pPr>
+              <w:spacing w:after="20" w:line="240" w:lineRule="auto"/>
+              <w:rPr>
+                <w:rFonts w:ascii="Consolas" w:eastAsia="Consolas" w:hAnsi="Consolas" w:cs="Consolas"/>
+                <w:color w:val="000000"/>
+                <w:u w:color="auto"/>
+              </w:rPr>
+            </w:pPr>
+            <w:r>
+              <w:rPr>
+                <w:rFonts w:ascii="Consolas" w:eastAsia="Consolas" w:hAnsi="Consolas" w:cs="Consolas"/>
+                <w:color w:val="000000"/>
+                <w:u w:color="auto"/>
+              </w:rPr>
+              <w:t>print("D:", D)</w:t>
+            </w:r>
+          </w:p>
+          <w:p>
+            <w:pPr>
+              <w:spacing w:after="20" w:line="240" w:lineRule="auto"/>
+              <w:rPr>
+                <w:rFonts w:ascii="Consolas" w:eastAsia="Consolas" w:hAnsi="Consolas" w:cs="Consolas"/>
+                <w:color w:val="000000"/>
+                <w:u w:color="auto"/>
+              </w:rPr>
+            </w:pPr>
+            <w:r>
+              <w:rPr>
+                <w:rFonts w:ascii="Consolas" w:eastAsia="Consolas" w:hAnsi="Consolas" w:cs="Consolas"/>
+                <w:color w:val="000000"/>
+                <w:u w:color="auto"/>
+              </w:rPr>
+              <w:t>print("G:", G)</w:t>
+            </w:r>
+          </w:p>
+          <w:p>
+            <w:pPr>
+              <w:spacing w:after="20" w:line="240" w:lineRule="auto"/>
+              <w:rPr>
+                <w:rFonts w:ascii="Consolas" w:eastAsia="Consolas" w:hAnsi="Consolas" w:cs="Consolas"/>
+                <w:color w:val="000000"/>
+                <w:u w:color="auto"/>
+              </w:rPr>
+            </w:pPr>
+            <w:r>
+              <w:rPr>
+                <w:rFonts w:ascii="Consolas" w:eastAsia="Consolas" w:hAnsi="Consolas" w:cs="Consolas"/>
+                <w:color w:val="000000"/>
+                <w:u w:color="auto"/>
+              </w:rPr>
+              <w:t># ===== 수정 금지 끝 =====</w:t>
+            </w:r>
           </w:p>
         </w:tc>
       </w:tr>
@@ -2368,6 +3273,55 @@
                 <w:sz w:val="20"/>
               </w:rPr>
             </w:pPr>
+            <w:r>
+              <w:rPr>
+                <w:rFonts w:ascii="Arial" w:hAnsi="Arial" w:cs="Arial"/>
+                <w:sz w:val="20"/>
+              </w:rPr>
+              <w:drawing>
+                <wp:inline distT="0" distB="0" distL="180" distR="180">
+                  <wp:extent cx="3533775" cy="5400675"/>
+                  <wp:effectExtent l="0" t="0" r="0" b="0"/>
+                  <wp:docPr id="1029" name=""/>
+                  <wp:cNvGraphicFramePr>
+                    <a:graphicFrameLocks xmlns:a="http://schemas.openxmlformats.org/drawingml/2006/main" noChangeAspect="1"/>
+                  </wp:cNvGraphicFramePr>
+                  <a:graphic xmlns:a="http://schemas.openxmlformats.org/drawingml/2006/main">
+                    <a:graphicData uri="http://schemas.openxmlformats.org/drawingml/2006/picture">
+                      <pic:pic xmlns:pic="http://schemas.openxmlformats.org/drawingml/2006/picture">
+                        <pic:nvPicPr>
+                          <pic:cNvPr id="1029" name=""/>
+                          <pic:cNvPicPr>
+                            <a:picLocks noChangeAspect="1" noUngrp="1"/>
+                          </pic:cNvPicPr>
+                        </pic:nvPicPr>
+                        <pic:blipFill>
+                          <a:blip r:embed="rId4">
+                            <a:extLst>
+                              <a:ext uri="{28A0092B-C50C-407E-A947-70E740481C1C}">
+                                <a14:useLocalDpi xmlns:a14="http://schemas.microsoft.com/office/drawing/2010/main" val="0"/>
+                              </a:ext>
+                            </a:extLst>
+                          </a:blip>
+                          <a:stretch>
+                            <a:fillRect/>
+                          </a:stretch>
+                        </pic:blipFill>
+                        <pic:spPr>
+                          <a:xfrm>
+                            <a:off x="0" y="0"/>
+                            <a:ext cx="3533775" cy="5400675"/>
+                          </a:xfrm>
+                          <a:prstGeom prst="rect">
+                            <a:avLst/>
+                          </a:prstGeom>
+                        </pic:spPr>
+                      </pic:pic>
+                    </a:graphicData>
+                  </a:graphic>
+                </wp:inline>
+              </w:drawing>
+            </w:r>
           </w:p>
           <w:p>
             <w:pPr>
@@ -2383,36 +3337,59 @@
               <w:spacing w:after="0" w:line="240" w:lineRule="auto"/>
               <w:rPr>
                 <w:rFonts w:ascii="Arial" w:hAnsi="Arial" w:cs="Arial"/>
-                <w:sz w:val="20"/>
-              </w:rPr>
-            </w:pPr>
-          </w:p>
-          <w:p>
-            <w:pPr>
-              <w:spacing w:after="0" w:line="240" w:lineRule="auto"/>
+                <w:b w:val="0"/>
+                <w:bCs w:val="0"/>
+                <w:sz w:val="20"/>
+              </w:rPr>
+            </w:pPr>
+            <w:r>
               <w:rPr>
                 <w:rFonts w:ascii="Arial" w:hAnsi="Arial" w:cs="Arial"/>
                 <w:sz w:val="20"/>
               </w:rPr>
-            </w:pPr>
-          </w:p>
-          <w:p>
-            <w:pPr>
-              <w:spacing w:after="0" w:line="240" w:lineRule="auto"/>
-              <w:rPr>
-                <w:rFonts w:ascii="Arial" w:hAnsi="Arial" w:cs="Arial"/>
-                <w:b w:val="0"/>
-                <w:bCs w:val="0"/>
-                <w:sz w:val="20"/>
-              </w:rPr>
-            </w:pPr>
-            <w:r>
-              <w:rPr>
-                <w:b w:val="0"/>
-                <w:bCs w:val="0"/>
-                <w:color w:val="FF0000"/>
-              </w:rPr>
-              <w:br/>
+              <w:drawing>
+                <wp:inline distT="0" distB="0" distL="180" distR="180">
+                  <wp:extent cx="5731510" cy="2435225"/>
+                  <wp:effectExtent l="0" t="0" r="0" b="0"/>
+                  <wp:docPr id="1030" name=""/>
+                  <wp:cNvGraphicFramePr>
+                    <a:graphicFrameLocks xmlns:a="http://schemas.openxmlformats.org/drawingml/2006/main" noChangeAspect="1"/>
+                  </wp:cNvGraphicFramePr>
+                  <a:graphic xmlns:a="http://schemas.openxmlformats.org/drawingml/2006/main">
+                    <a:graphicData uri="http://schemas.openxmlformats.org/drawingml/2006/picture">
+                      <pic:pic xmlns:pic="http://schemas.openxmlformats.org/drawingml/2006/picture">
+                        <pic:nvPicPr>
+                          <pic:cNvPr id="1030" name=""/>
+                          <pic:cNvPicPr>
+                            <a:picLocks noChangeAspect="1" noUngrp="1"/>
+                          </pic:cNvPicPr>
+                        </pic:nvPicPr>
+                        <pic:blipFill>
+                          <a:blip r:embed="rId5">
+                            <a:extLst>
+                              <a:ext uri="{28A0092B-C50C-407E-A947-70E740481C1C}">
+                                <a14:useLocalDpi xmlns:a14="http://schemas.microsoft.com/office/drawing/2010/main" val="0"/>
+                              </a:ext>
+                            </a:extLst>
+                          </a:blip>
+                          <a:stretch>
+                            <a:fillRect/>
+                          </a:stretch>
+                        </pic:blipFill>
+                        <pic:spPr>
+                          <a:xfrm>
+                            <a:off x="0" y="0"/>
+                            <a:ext cx="5731510" cy="2435225"/>
+                          </a:xfrm>
+                          <a:prstGeom prst="rect">
+                            <a:avLst/>
+                          </a:prstGeom>
+                        </pic:spPr>
+                      </pic:pic>
+                    </a:graphicData>
+                  </a:graphic>
+                </wp:inline>
+              </w:drawing>
             </w:r>
           </w:p>
         </w:tc>

</xml_diff>